<commit_message>
IA5 done, IA6 start
</commit_message>
<xml_diff>
--- a/41IA Intelektualnyj analiz danyh/5/IA_KNT-122_Onyshchenko_19_PR5.docx
+++ b/41IA Intelektualnyj analiz danyh/5/IA_KNT-122_Onyshchenko_19_PR5.docx
@@ -690,20 +690,405 @@
     </w:p>
     <w:p>
       <w:pPr>
-        <w:pStyle w:val="p11"/>
-        <w:rPr/>
-      </w:pPr>
-      <w:r>
-        <w:rPr/>
-      </w:r>
-    </w:p>
-    <w:p>
-      <w:pPr>
-        <w:pStyle w:val="p11"/>
-        <w:rPr/>
-      </w:pPr>
-      <w:r>
-        <w:rPr/>
+        <w:pStyle w:val="H2"/>
+        <w:rPr/>
+      </w:pPr>
+      <w:r>
+        <w:rPr/>
+        <w:t>Код</w:t>
+      </w:r>
+    </w:p>
+    <w:p>
+      <w:pPr>
+        <w:pStyle w:val="p11"/>
+        <w:rPr/>
+      </w:pPr>
+      <w:r>
+        <w:rPr/>
+      </w:r>
+    </w:p>
+    <w:p>
+      <w:pPr>
+        <w:pStyle w:val="Code"/>
+        <w:rPr/>
+      </w:pPr>
+      <w:r>
+        <w:rPr/>
+        <w:t>import os</w:t>
+      </w:r>
+    </w:p>
+    <w:p>
+      <w:pPr>
+        <w:pStyle w:val="Code"/>
+        <w:rPr/>
+      </w:pPr>
+      <w:r>
+        <w:rPr/>
+        <w:t>import pandas as pd</w:t>
+      </w:r>
+    </w:p>
+    <w:p>
+      <w:pPr>
+        <w:pStyle w:val="Code"/>
+        <w:rPr/>
+      </w:pPr>
+      <w:r>
+        <w:rPr/>
+        <w:t>from mlxtend.frequent_patterns import apriori, association_rules, fpgrowth</w:t>
+      </w:r>
+    </w:p>
+    <w:p>
+      <w:pPr>
+        <w:pStyle w:val="Code"/>
+        <w:rPr/>
+      </w:pPr>
+      <w:r>
+        <w:rPr/>
+      </w:r>
+    </w:p>
+    <w:p>
+      <w:pPr>
+        <w:pStyle w:val="Code"/>
+        <w:rPr/>
+      </w:pPr>
+      <w:r>
+        <w:rPr/>
+        <w:t>current_dir = os.path.dirname(os.path.abspath(__file__))</w:t>
+      </w:r>
+    </w:p>
+    <w:p>
+      <w:pPr>
+        <w:pStyle w:val="Code"/>
+        <w:rPr/>
+      </w:pPr>
+      <w:r>
+        <w:rPr/>
+        <w:t>file_name = "marketbasket.csv"</w:t>
+      </w:r>
+    </w:p>
+    <w:p>
+      <w:pPr>
+        <w:pStyle w:val="Code"/>
+        <w:rPr/>
+      </w:pPr>
+      <w:r>
+        <w:rPr/>
+        <w:t>file_path = os.path.join(current_dir, file_name)</w:t>
+      </w:r>
+    </w:p>
+    <w:p>
+      <w:pPr>
+        <w:pStyle w:val="Code"/>
+        <w:rPr/>
+      </w:pPr>
+      <w:r>
+        <w:rPr/>
+      </w:r>
+    </w:p>
+    <w:p>
+      <w:pPr>
+        <w:pStyle w:val="Code"/>
+        <w:rPr/>
+      </w:pPr>
+      <w:r>
+        <w:rPr/>
+        <w:t>df = pd.read_csv(file_path)</w:t>
+      </w:r>
+    </w:p>
+    <w:p>
+      <w:pPr>
+        <w:pStyle w:val="Code"/>
+        <w:rPr/>
+      </w:pPr>
+      <w:r>
+        <w:rPr/>
+        <w:t>df = df.fillna(0)</w:t>
+      </w:r>
+    </w:p>
+    <w:p>
+      <w:pPr>
+        <w:pStyle w:val="Code"/>
+        <w:rPr/>
+      </w:pPr>
+      <w:r>
+        <w:rPr/>
+        <w:t>for column in df.columns:</w:t>
+      </w:r>
+    </w:p>
+    <w:p>
+      <w:pPr>
+        <w:pStyle w:val="Code"/>
+        <w:rPr/>
+      </w:pPr>
+      <w:r>
+        <w:rPr/>
+        <w:t xml:space="preserve">    </w:t>
+      </w:r>
+      <w:r>
+        <w:rPr/>
+        <w:t>df[column] = df[column].astype("bool")</w:t>
+      </w:r>
+    </w:p>
+    <w:p>
+      <w:pPr>
+        <w:pStyle w:val="Code"/>
+        <w:rPr/>
+      </w:pPr>
+      <w:r>
+        <w:rPr/>
+        <w:t>print(df.head())</w:t>
+      </w:r>
+    </w:p>
+    <w:p>
+      <w:pPr>
+        <w:pStyle w:val="Code"/>
+        <w:rPr/>
+      </w:pPr>
+      <w:r>
+        <w:rPr/>
+      </w:r>
+    </w:p>
+    <w:p>
+      <w:pPr>
+        <w:pStyle w:val="Code"/>
+        <w:rPr/>
+      </w:pPr>
+      <w:r>
+        <w:rPr/>
+        <w:t># --- Apriori ---</w:t>
+      </w:r>
+    </w:p>
+    <w:p>
+      <w:pPr>
+        <w:pStyle w:val="Code"/>
+        <w:rPr/>
+      </w:pPr>
+      <w:r>
+        <w:rPr/>
+        <w:t>apriori_result = apriori(df, min_support=0.01, use_colnames=True)</w:t>
+      </w:r>
+    </w:p>
+    <w:p>
+      <w:pPr>
+        <w:pStyle w:val="Code"/>
+        <w:rPr/>
+      </w:pPr>
+      <w:r>
+        <w:rPr/>
+        <w:t>print(apriori_result)</w:t>
+      </w:r>
+    </w:p>
+    <w:p>
+      <w:pPr>
+        <w:pStyle w:val="Code"/>
+        <w:rPr/>
+      </w:pPr>
+      <w:r>
+        <w:rPr/>
+      </w:r>
+    </w:p>
+    <w:p>
+      <w:pPr>
+        <w:pStyle w:val="Code"/>
+        <w:rPr/>
+      </w:pPr>
+      <w:r>
+        <w:rPr/>
+        <w:t>RULES_COUNT = 3</w:t>
+      </w:r>
+    </w:p>
+    <w:p>
+      <w:pPr>
+        <w:pStyle w:val="Code"/>
+        <w:rPr/>
+      </w:pPr>
+      <w:r>
+        <w:rPr/>
+        <w:t>rules = association_rules(apriori_result, metric="confidence", min_threshold=0.1)</w:t>
+      </w:r>
+    </w:p>
+    <w:p>
+      <w:pPr>
+        <w:pStyle w:val="Code"/>
+        <w:rPr/>
+      </w:pPr>
+      <w:r>
+        <w:rPr/>
+        <w:t>sorted_rules = rules.sort_values("confidence", ascending=False)</w:t>
+      </w:r>
+    </w:p>
+    <w:p>
+      <w:pPr>
+        <w:pStyle w:val="Code"/>
+        <w:rPr/>
+      </w:pPr>
+      <w:r>
+        <w:rPr/>
+        <w:t>results_matrix = rules[["antecedents", "consequents", "confidence"]]</w:t>
+      </w:r>
+    </w:p>
+    <w:p>
+      <w:pPr>
+        <w:pStyle w:val="Code"/>
+        <w:rPr/>
+      </w:pPr>
+      <w:r>
+        <w:rPr/>
+        <w:t>print(results_matrix.head(RULES_COUNT))</w:t>
+      </w:r>
+    </w:p>
+    <w:p>
+      <w:pPr>
+        <w:pStyle w:val="Code"/>
+        <w:rPr/>
+      </w:pPr>
+      <w:r>
+        <w:rPr/>
+      </w:r>
+    </w:p>
+    <w:p>
+      <w:pPr>
+        <w:pStyle w:val="Code"/>
+        <w:rPr/>
+      </w:pPr>
+      <w:r>
+        <w:rPr/>
+        <w:t># --- FP-Growth ---</w:t>
+      </w:r>
+    </w:p>
+    <w:p>
+      <w:pPr>
+        <w:pStyle w:val="Code"/>
+        <w:rPr/>
+      </w:pPr>
+      <w:r>
+        <w:rPr/>
+        <w:t>fpgrowth_result = fpgrowth(df, min_support=0.01, use_colnames=True)</w:t>
+      </w:r>
+    </w:p>
+    <w:p>
+      <w:pPr>
+        <w:pStyle w:val="Code"/>
+        <w:rPr/>
+      </w:pPr>
+      <w:r>
+        <w:rPr/>
+        <w:t>rules = association_rules(fpgrowth_result, metric="confidence", min_threshold=0.1)</w:t>
+      </w:r>
+    </w:p>
+    <w:p>
+      <w:pPr>
+        <w:pStyle w:val="Code"/>
+        <w:rPr/>
+      </w:pPr>
+      <w:r>
+        <w:rPr/>
+        <w:t>sorted_rules = rules.sort_values("confidence", ascending=False)</w:t>
+      </w:r>
+    </w:p>
+    <w:p>
+      <w:pPr>
+        <w:pStyle w:val="Code"/>
+        <w:rPr/>
+      </w:pPr>
+      <w:r>
+        <w:rPr/>
+        <w:t>results_matrix = rules[["antecedents", "consequents", "confidence"]]</w:t>
+      </w:r>
+    </w:p>
+    <w:p>
+      <w:pPr>
+        <w:pStyle w:val="Code"/>
+        <w:rPr/>
+      </w:pPr>
+      <w:r>
+        <w:rPr/>
+        <w:t>print(results_matrix.head(7))</w:t>
+      </w:r>
+    </w:p>
+    <w:p>
+      <w:pPr>
+        <w:pStyle w:val="p11"/>
+        <w:rPr/>
+      </w:pPr>
+      <w:r>
+        <w:rPr/>
+      </w:r>
+    </w:p>
+    <w:p>
+      <w:pPr>
+        <w:pStyle w:val="H2"/>
+        <w:rPr/>
+      </w:pPr>
+      <w:r>
+        <w:rPr/>
+        <w:t>Результати</w:t>
+      </w:r>
+    </w:p>
+    <w:p>
+      <w:pPr>
+        <w:pStyle w:val="IMG1"/>
+        <w:rPr/>
+      </w:pPr>
+      <w:r>
+        <w:rPr/>
+      </w:r>
+    </w:p>
+    <w:p>
+      <w:pPr>
+        <w:pStyle w:val="IMG1"/>
+        <w:rPr/>
+      </w:pPr>
+      <w:r>
+        <w:rPr/>
+        <w:drawing>
+          <wp:inline distT="0" distB="0" distL="0" distR="0">
+            <wp:extent cx="5731510" cy="4611370"/>
+            <wp:effectExtent l="0" t="0" r="0" b="0"/>
+            <wp:docPr id="1" name="Зображення1"/>
+            <wp:cNvGraphicFramePr>
+              <a:graphicFrameLocks xmlns:a="http://schemas.openxmlformats.org/drawingml/2006/main" noChangeAspect="1"/>
+            </wp:cNvGraphicFramePr>
+            <a:graphic xmlns:a="http://schemas.openxmlformats.org/drawingml/2006/main">
+              <a:graphicData uri="http://schemas.openxmlformats.org/drawingml/2006/picture">
+                <pic:pic xmlns:pic="http://schemas.openxmlformats.org/drawingml/2006/picture">
+                  <pic:nvPicPr>
+                    <pic:cNvPr id="1" name="Зображення1"/>
+                    <pic:cNvPicPr>
+                      <a:picLocks noChangeAspect="1" noChangeArrowheads="1"/>
+                    </pic:cNvPicPr>
+                  </pic:nvPicPr>
+                  <pic:blipFill>
+                    <a:blip r:embed="rId2"/>
+                    <a:stretch>
+                      <a:fillRect/>
+                    </a:stretch>
+                  </pic:blipFill>
+                  <pic:spPr bwMode="auto">
+                    <a:xfrm>
+                      <a:off x="0" y="0"/>
+                      <a:ext cx="5731510" cy="4611370"/>
+                    </a:xfrm>
+                    <a:prstGeom prst="rect">
+                      <a:avLst/>
+                    </a:prstGeom>
+                    <a:noFill/>
+                  </pic:spPr>
+                </pic:pic>
+              </a:graphicData>
+            </a:graphic>
+          </wp:inline>
+        </w:drawing>
+      </w:r>
+    </w:p>
+    <w:p>
+      <w:pPr>
+        <w:pStyle w:val="IMG1"/>
+        <w:rPr/>
+      </w:pPr>
+      <w:r>
+        <w:rPr/>
+        <w:t>Рисунок 1.1 — Виведення у консоль</w:t>
       </w:r>
     </w:p>
     <w:p>
@@ -785,6 +1170,38 @@
     </w:p>
     <w:p>
       <w:pPr>
+        <w:pStyle w:val="P1"/>
+        <w:rPr/>
+      </w:pPr>
+      <w:r>
+        <w:rPr/>
+      </w:r>
+    </w:p>
+    <w:p>
+      <w:pPr>
+        <w:pStyle w:val="P1"/>
+        <w:rPr>
+          <w:lang w:val="uk-UA"/>
+        </w:rPr>
+      </w:pPr>
+      <w:r>
+        <w:rPr>
+          <w:lang w:val="uk-UA"/>
+        </w:rPr>
+        <w:t>Частий набір є множиною елементів, що зустрічаються у транзакціях.</w:t>
+      </w:r>
+    </w:p>
+    <w:p>
+      <w:pPr>
+        <w:pStyle w:val="P1"/>
+        <w:rPr/>
+      </w:pPr>
+      <w:r>
+        <w:rPr/>
+      </w:r>
+    </w:p>
+    <w:p>
+      <w:pPr>
         <w:pStyle w:val="H2"/>
         <w:rPr/>
       </w:pPr>
@@ -795,12 +1212,117 @@
     </w:p>
     <w:p>
       <w:pPr>
+        <w:pStyle w:val="P1"/>
+        <w:rPr/>
+      </w:pPr>
+      <w:r>
+        <w:rPr/>
+      </w:r>
+    </w:p>
+    <w:p>
+      <w:pPr>
+        <w:pStyle w:val="P1"/>
+        <w:rPr/>
+      </w:pPr>
+      <w:r>
+        <w:rPr/>
+        <w:t>Правило називається сильним, якщо воно має високу підтримку (</w:t>
+      </w:r>
+      <w:r>
+        <w:rPr>
+          <w:lang w:val="en-US"/>
+        </w:rPr>
+        <w:t xml:space="preserve">support) </w:t>
+      </w:r>
+      <w:r>
+        <w:rPr/>
+        <w:t xml:space="preserve">та достовірність </w:t>
+      </w:r>
+      <w:r>
+        <w:rPr>
+          <w:lang w:val="en-US"/>
+        </w:rPr>
+        <w:t>(confidence)</w:t>
+      </w:r>
+      <w:r>
+        <w:rPr/>
+        <w:t>.</w:t>
+      </w:r>
+    </w:p>
+    <w:p>
+      <w:pPr>
+        <w:pStyle w:val="P1"/>
+        <w:rPr/>
+      </w:pPr>
+      <w:r>
+        <w:rPr/>
+      </w:r>
+    </w:p>
+    <w:p>
+      <w:pPr>
         <w:pStyle w:val="H2"/>
         <w:rPr/>
       </w:pPr>
       <w:r>
         <w:rPr/>
         <w:t>З яких двох кроків складається пошук асоціативних правил?</w:t>
+      </w:r>
+    </w:p>
+    <w:p>
+      <w:pPr>
+        <w:pStyle w:val="P1"/>
+        <w:rPr/>
+      </w:pPr>
+      <w:r>
+        <w:rPr/>
+      </w:r>
+    </w:p>
+    <w:p>
+      <w:pPr>
+        <w:pStyle w:val="P1"/>
+        <w:rPr/>
+      </w:pPr>
+      <w:r>
+        <w:rPr/>
+        <w:t>Пошук асоціативних правил містить такі кроки:</w:t>
+      </w:r>
+    </w:p>
+    <w:p>
+      <w:pPr>
+        <w:pStyle w:val="P1"/>
+        <w:rPr/>
+      </w:pPr>
+      <w:r>
+        <w:rPr/>
+      </w:r>
+    </w:p>
+    <w:p>
+      <w:pPr>
+        <w:pStyle w:val="P1"/>
+        <w:rPr/>
+      </w:pPr>
+      <w:r>
+        <w:rPr/>
+        <w:t>1. Пошук частих наборів;</w:t>
+      </w:r>
+    </w:p>
+    <w:p>
+      <w:pPr>
+        <w:pStyle w:val="P1"/>
+        <w:rPr/>
+      </w:pPr>
+      <w:r>
+        <w:rPr/>
+        <w:t>2. Генерація правил на їх основі.</w:t>
+      </w:r>
+    </w:p>
+    <w:p>
+      <w:pPr>
+        <w:pStyle w:val="P1"/>
+        <w:rPr/>
+      </w:pPr>
+      <w:r>
+        <w:rPr/>
       </w:r>
     </w:p>
     <w:p>

</xml_diff>

<commit_message>
IA5 done praise King Jesus
</commit_message>
<xml_diff>
--- a/41IA Intelektualnyj analiz danyh/5/IA_KNT-122_Onyshchenko_19_PR5.docx
+++ b/41IA Intelektualnyj analiz danyh/5/IA_KNT-122_Onyshchenko_19_PR5.docx
@@ -523,7 +523,7 @@
           <w:spacing w:val="0"/>
           <w:lang w:val="en-US"/>
         </w:rPr>
-        <w:t>1. Виконати пошук асоц  іативних правил за допомогою програми WEKA:</w:t>
+        <w:t>1. Виконати пошук асоціативних правил за допомогою програми WEKA:</w:t>
       </w:r>
     </w:p>
     <w:p>
@@ -598,7 +598,7 @@
           <w:spacing w:val="0"/>
           <w:lang w:val="en-US"/>
         </w:rPr>
-        <w:t xml:space="preserve">- визначити які  значення для порогу підтримки та достовірності було використано в побудованій моделі; </w:t>
+        <w:t xml:space="preserve">- визначити які значення для порогу підтримки та достовірності було використано в побудованій моделі; </w:t>
       </w:r>
     </w:p>
     <w:p>
@@ -930,11 +930,300 @@
     </w:p>
     <w:p>
       <w:pPr>
-        <w:pStyle w:val="p11"/>
-        <w:rPr/>
-      </w:pPr>
-      <w:r>
-        <w:rPr/>
+        <w:pStyle w:val="H2"/>
+        <w:rPr/>
+      </w:pPr>
+      <w:r>
+        <w:rPr/>
+        <w:t xml:space="preserve">1 </w:t>
+      </w:r>
+      <w:r>
+        <w:rPr/>
+        <w:t>З</w:t>
+      </w:r>
+      <w:r>
+        <w:rPr/>
+        <w:t>авантажити вибірку «vote.arff»</w:t>
+      </w:r>
+    </w:p>
+    <w:p>
+      <w:pPr>
+        <w:pStyle w:val="P1"/>
+        <w:rPr/>
+      </w:pPr>
+      <w:r>
+        <w:rPr/>
+      </w:r>
+    </w:p>
+    <w:p>
+      <w:pPr>
+        <w:pStyle w:val="P1"/>
+        <w:rPr/>
+      </w:pPr>
+      <w:r>
+        <w:rPr/>
+        <w:t>Вибірку завантажено. Детальніше на рисунку нижче:</w:t>
+      </w:r>
+    </w:p>
+    <w:p>
+      <w:pPr>
+        <w:pStyle w:val="P1"/>
+        <w:rPr/>
+      </w:pPr>
+      <w:r>
+        <w:rPr/>
+      </w:r>
+    </w:p>
+    <w:p>
+      <w:pPr>
+        <w:pStyle w:val="IMG1"/>
+        <w:rPr/>
+      </w:pPr>
+      <w:r>
+        <w:rPr/>
+        <w:drawing>
+          <wp:inline distT="0" distB="0" distL="0" distR="0">
+            <wp:extent cx="5731510" cy="6268720"/>
+            <wp:effectExtent l="0" t="0" r="0" b="0"/>
+            <wp:docPr id="1" name="Зображення1"/>
+            <wp:cNvGraphicFramePr>
+              <a:graphicFrameLocks xmlns:a="http://schemas.openxmlformats.org/drawingml/2006/main" noChangeAspect="1"/>
+            </wp:cNvGraphicFramePr>
+            <a:graphic xmlns:a="http://schemas.openxmlformats.org/drawingml/2006/main">
+              <a:graphicData uri="http://schemas.openxmlformats.org/drawingml/2006/picture">
+                <pic:pic xmlns:pic="http://schemas.openxmlformats.org/drawingml/2006/picture">
+                  <pic:nvPicPr>
+                    <pic:cNvPr id="1" name="Зображення1"/>
+                    <pic:cNvPicPr>
+                      <a:picLocks noChangeAspect="1" noChangeArrowheads="1"/>
+                    </pic:cNvPicPr>
+                  </pic:nvPicPr>
+                  <pic:blipFill>
+                    <a:blip r:embed="rId2"/>
+                    <a:stretch>
+                      <a:fillRect/>
+                    </a:stretch>
+                  </pic:blipFill>
+                  <pic:spPr bwMode="auto">
+                    <a:xfrm>
+                      <a:off x="0" y="0"/>
+                      <a:ext cx="5731510" cy="6268720"/>
+                    </a:xfrm>
+                    <a:prstGeom prst="rect">
+                      <a:avLst/>
+                    </a:prstGeom>
+                    <a:noFill/>
+                  </pic:spPr>
+                </pic:pic>
+              </a:graphicData>
+            </a:graphic>
+          </wp:inline>
+        </w:drawing>
+      </w:r>
+    </w:p>
+    <w:p>
+      <w:pPr>
+        <w:pStyle w:val="IMG1"/>
+        <w:rPr/>
+      </w:pPr>
+      <w:r>
+        <w:rPr/>
+        <w:t>Рисунок 1.1 — Завантажена вибірка</w:t>
+      </w:r>
+    </w:p>
+    <w:p>
+      <w:pPr>
+        <w:pStyle w:val="P1"/>
+        <w:rPr/>
+      </w:pPr>
+      <w:r>
+        <w:rPr/>
+      </w:r>
+    </w:p>
+    <w:p>
+      <w:pPr>
+        <w:pStyle w:val="H2"/>
+        <w:rPr/>
+      </w:pPr>
+      <w:r>
+        <w:rPr/>
+        <w:t xml:space="preserve">2 </w:t>
+      </w:r>
+      <w:r>
+        <w:rPr/>
+        <w:t>А</w:t>
+      </w:r>
+      <w:r>
+        <w:rPr/>
+        <w:t>лгоритм пошуку асоціативних правил Apriori</w:t>
+      </w:r>
+    </w:p>
+    <w:p>
+      <w:pPr>
+        <w:pStyle w:val="P1"/>
+        <w:rPr/>
+      </w:pPr>
+      <w:r>
+        <w:rPr/>
+      </w:r>
+    </w:p>
+    <w:p>
+      <w:pPr>
+        <w:pStyle w:val="P1"/>
+        <w:rPr/>
+      </w:pPr>
+      <w:r>
+        <w:rPr/>
+        <w:t>Алгоритм запущено. Деталі на рисунку нижче:</w:t>
+      </w:r>
+    </w:p>
+    <w:p>
+      <w:pPr>
+        <w:pStyle w:val="IMG1"/>
+        <w:rPr/>
+      </w:pPr>
+      <w:r>
+        <w:rPr/>
+      </w:r>
+    </w:p>
+    <w:p>
+      <w:pPr>
+        <w:pStyle w:val="IMG1"/>
+        <w:rPr/>
+      </w:pPr>
+      <w:r>
+        <w:rPr/>
+        <w:drawing>
+          <wp:inline distT="0" distB="0" distL="0" distR="0">
+            <wp:extent cx="5731510" cy="6268720"/>
+            <wp:effectExtent l="0" t="0" r="0" b="0"/>
+            <wp:docPr id="2" name="Зображення2"/>
+            <wp:cNvGraphicFramePr>
+              <a:graphicFrameLocks xmlns:a="http://schemas.openxmlformats.org/drawingml/2006/main" noChangeAspect="1"/>
+            </wp:cNvGraphicFramePr>
+            <a:graphic xmlns:a="http://schemas.openxmlformats.org/drawingml/2006/main">
+              <a:graphicData uri="http://schemas.openxmlformats.org/drawingml/2006/picture">
+                <pic:pic xmlns:pic="http://schemas.openxmlformats.org/drawingml/2006/picture">
+                  <pic:nvPicPr>
+                    <pic:cNvPr id="2" name="Зображення2"/>
+                    <pic:cNvPicPr>
+                      <a:picLocks noChangeAspect="1" noChangeArrowheads="1"/>
+                    </pic:cNvPicPr>
+                  </pic:nvPicPr>
+                  <pic:blipFill>
+                    <a:blip r:embed="rId3"/>
+                    <a:stretch>
+                      <a:fillRect/>
+                    </a:stretch>
+                  </pic:blipFill>
+                  <pic:spPr bwMode="auto">
+                    <a:xfrm>
+                      <a:off x="0" y="0"/>
+                      <a:ext cx="5731510" cy="6268720"/>
+                    </a:xfrm>
+                    <a:prstGeom prst="rect">
+                      <a:avLst/>
+                    </a:prstGeom>
+                    <a:noFill/>
+                  </pic:spPr>
+                </pic:pic>
+              </a:graphicData>
+            </a:graphic>
+          </wp:inline>
+        </w:drawing>
+      </w:r>
+    </w:p>
+    <w:p>
+      <w:pPr>
+        <w:pStyle w:val="IMG1"/>
+        <w:rPr/>
+      </w:pPr>
+      <w:r>
+        <w:rPr/>
+        <w:t>Рисунок 2.1 — Запущений алгоритм</w:t>
+      </w:r>
+    </w:p>
+    <w:p>
+      <w:pPr>
+        <w:pStyle w:val="P1"/>
+        <w:rPr/>
+      </w:pPr>
+      <w:r>
+        <w:rPr/>
+      </w:r>
+    </w:p>
+    <w:p>
+      <w:pPr>
+        <w:pStyle w:val="H2"/>
+        <w:rPr/>
+      </w:pPr>
+      <w:r>
+        <w:rPr/>
+        <w:t xml:space="preserve">3 </w:t>
+      </w:r>
+      <w:r>
+        <w:rPr/>
+        <w:t>В</w:t>
+      </w:r>
+      <w:r>
+        <w:rPr/>
+        <w:t>изначити які значення для порогу підтримки та достовірності було використано в побудованій моделі</w:t>
+      </w:r>
+    </w:p>
+    <w:p>
+      <w:pPr>
+        <w:pStyle w:val="P1"/>
+        <w:rPr/>
+      </w:pPr>
+      <w:r>
+        <w:rPr/>
+      </w:r>
+    </w:p>
+    <w:p>
+      <w:pPr>
+        <w:pStyle w:val="P1"/>
+        <w:rPr/>
+      </w:pPr>
+      <w:r>
+        <w:rPr/>
+        <w:t>Мінімальне значення підтримки є 0,45.</w:t>
+      </w:r>
+    </w:p>
+    <w:p>
+      <w:pPr>
+        <w:pStyle w:val="P1"/>
+        <w:rPr/>
+      </w:pPr>
+      <w:r>
+        <w:rPr/>
+        <w:t>Мінімальне значення достовірності є 0,9.</w:t>
+      </w:r>
+    </w:p>
+    <w:p>
+      <w:pPr>
+        <w:pStyle w:val="P1"/>
+        <w:rPr/>
+      </w:pPr>
+      <w:r>
+        <w:rPr/>
+      </w:r>
+    </w:p>
+    <w:p>
+      <w:pPr>
+        <w:pStyle w:val="H2"/>
+        <w:rPr/>
+      </w:pPr>
+      <w:r>
+        <w:rPr/>
+        <w:t xml:space="preserve">4 </w:t>
+      </w:r>
+      <w:r>
+        <w:rPr/>
+        <w:t xml:space="preserve">Десять </w:t>
+      </w:r>
+      <w:r>
+        <w:rPr/>
+        <w:t xml:space="preserve">найкращих знайдених правил </w:t>
       </w:r>
     </w:p>
     <w:p>
@@ -948,19 +1237,2645 @@
         <w:rPr>
           <w:lang w:val="uk-UA"/>
         </w:rPr>
-        <w:t xml:space="preserve">Вибірку </w:t>
+      </w:r>
+    </w:p>
+    <w:p>
+      <w:pPr>
+        <w:pStyle w:val="p11"/>
+        <w:rPr>
+          <w:lang w:val="uk-UA"/>
+        </w:rPr>
+      </w:pPr>
+      <w:r>
+        <w:rPr>
+          <w:lang w:val="uk-UA"/>
+        </w:rPr>
+        <w:t>Десять найкращих правил наведено на таблиці нижче:</w:t>
+      </w:r>
+    </w:p>
+    <w:p>
+      <w:pPr>
+        <w:pStyle w:val="p11"/>
+        <w:rPr>
+          <w:lang w:val="uk-UA"/>
+        </w:rPr>
+      </w:pPr>
+      <w:r>
+        <w:rPr>
+          <w:lang w:val="uk-UA"/>
+        </w:rPr>
+      </w:r>
+    </w:p>
+    <w:p>
+      <w:pPr>
+        <w:pStyle w:val="p11"/>
+        <w:rPr>
+          <w:lang w:val="uk-UA"/>
+        </w:rPr>
+      </w:pPr>
+      <w:r>
+        <w:rPr>
+          <w:lang w:val="uk-UA"/>
+        </w:rPr>
+        <w:t xml:space="preserve">Таблиця </w:t>
+      </w:r>
+      <w:r>
+        <w:rPr>
+          <w:lang w:val="uk-UA"/>
+        </w:rPr>
+        <w:t>4</w:t>
+      </w:r>
+      <w:r>
+        <w:rPr>
+          <w:lang w:val="uk-UA"/>
+        </w:rPr>
+        <w:t>.1 — Десять найкращих правил</w:t>
+      </w:r>
+    </w:p>
+    <w:tbl>
+      <w:tblPr>
+        <w:tblW w:w="9026" w:type="dxa"/>
+        <w:jc w:val="left"/>
+        <w:tblInd w:w="55" w:type="dxa"/>
+        <w:tblLayout w:type="fixed"/>
+        <w:tblCellMar>
+          <w:top w:w="55" w:type="dxa"/>
+          <w:left w:w="55" w:type="dxa"/>
+          <w:bottom w:w="55" w:type="dxa"/>
+          <w:right w:w="55" w:type="dxa"/>
+        </w:tblCellMar>
+      </w:tblPr>
+      <w:tblGrid>
+        <w:gridCol w:w="372"/>
+        <w:gridCol w:w="7188"/>
+        <w:gridCol w:w="1466"/>
+      </w:tblGrid>
+      <w:tr>
+        <w:trPr>
+          <w:tblHeader w:val="true"/>
+        </w:trPr>
+        <w:tc>
+          <w:tcPr>
+            <w:tcW w:w="372" w:type="dxa"/>
+            <w:tcBorders>
+              <w:top w:val="single" w:sz="4" w:space="0" w:color="000000"/>
+              <w:left w:val="single" w:sz="4" w:space="0" w:color="000000"/>
+              <w:bottom w:val="single" w:sz="4" w:space="0" w:color="000000"/>
+            </w:tcBorders>
+            <w:vAlign w:val="center"/>
+          </w:tcPr>
+          <w:p>
+            <w:pPr>
+              <w:pStyle w:val="Style17"/>
+              <w:spacing w:lineRule="auto" w:line="240"/>
+              <w:ind w:hanging="0" w:left="0" w:right="0"/>
+              <w:jc w:val="left"/>
+              <w:rPr>
+                <w:sz w:val="24"/>
+                <w:szCs w:val="24"/>
+              </w:rPr>
+            </w:pPr>
+            <w:r>
+              <w:rPr>
+                <w:sz w:val="24"/>
+                <w:szCs w:val="24"/>
+              </w:rPr>
+              <w:t>№</w:t>
+            </w:r>
+          </w:p>
+        </w:tc>
+        <w:tc>
+          <w:tcPr>
+            <w:tcW w:w="7188" w:type="dxa"/>
+            <w:tcBorders>
+              <w:top w:val="single" w:sz="4" w:space="0" w:color="000000"/>
+              <w:left w:val="single" w:sz="4" w:space="0" w:color="000000"/>
+              <w:bottom w:val="single" w:sz="4" w:space="0" w:color="000000"/>
+            </w:tcBorders>
+            <w:vAlign w:val="center"/>
+          </w:tcPr>
+          <w:p>
+            <w:pPr>
+              <w:pStyle w:val="Style17"/>
+              <w:spacing w:lineRule="auto" w:line="240"/>
+              <w:ind w:hanging="0" w:left="0" w:right="0"/>
+              <w:jc w:val="left"/>
+              <w:rPr>
+                <w:sz w:val="24"/>
+                <w:szCs w:val="24"/>
+              </w:rPr>
+            </w:pPr>
+            <w:r>
+              <w:rPr>
+                <w:sz w:val="24"/>
+                <w:szCs w:val="24"/>
+              </w:rPr>
+              <w:t>Правило</w:t>
+            </w:r>
+          </w:p>
+        </w:tc>
+        <w:tc>
+          <w:tcPr>
+            <w:tcW w:w="1466" w:type="dxa"/>
+            <w:tcBorders>
+              <w:top w:val="single" w:sz="4" w:space="0" w:color="000000"/>
+              <w:left w:val="single" w:sz="4" w:space="0" w:color="000000"/>
+              <w:bottom w:val="single" w:sz="4" w:space="0" w:color="000000"/>
+              <w:right w:val="single" w:sz="4" w:space="0" w:color="000000"/>
+            </w:tcBorders>
+            <w:vAlign w:val="center"/>
+          </w:tcPr>
+          <w:p>
+            <w:pPr>
+              <w:pStyle w:val="Style17"/>
+              <w:spacing w:lineRule="auto" w:line="240"/>
+              <w:ind w:hanging="0" w:left="0" w:right="0"/>
+              <w:jc w:val="left"/>
+              <w:rPr>
+                <w:sz w:val="24"/>
+                <w:szCs w:val="24"/>
+              </w:rPr>
+            </w:pPr>
+            <w:r>
+              <w:rPr>
+                <w:sz w:val="24"/>
+                <w:szCs w:val="24"/>
+              </w:rPr>
+              <w:t>Підтримка</w:t>
+            </w:r>
+          </w:p>
+        </w:tc>
+      </w:tr>
+      <w:tr>
+        <w:trPr/>
+        <w:tc>
+          <w:tcPr>
+            <w:tcW w:w="372" w:type="dxa"/>
+            <w:tcBorders>
+              <w:left w:val="single" w:sz="4" w:space="0" w:color="000000"/>
+              <w:bottom w:val="single" w:sz="4" w:space="0" w:color="000000"/>
+            </w:tcBorders>
+            <w:vAlign w:val="center"/>
+          </w:tcPr>
+          <w:p>
+            <w:pPr>
+              <w:pStyle w:val="Style16"/>
+              <w:spacing w:lineRule="auto" w:line="240"/>
+              <w:ind w:hanging="0" w:left="0" w:right="0"/>
+              <w:rPr>
+                <w:sz w:val="24"/>
+                <w:szCs w:val="24"/>
+              </w:rPr>
+            </w:pPr>
+            <w:r>
+              <w:rPr>
+                <w:sz w:val="24"/>
+                <w:szCs w:val="24"/>
+              </w:rPr>
+              <w:t>1</w:t>
+            </w:r>
+          </w:p>
+        </w:tc>
+        <w:tc>
+          <w:tcPr>
+            <w:tcW w:w="7188" w:type="dxa"/>
+            <w:tcBorders>
+              <w:left w:val="single" w:sz="4" w:space="0" w:color="000000"/>
+              <w:bottom w:val="single" w:sz="4" w:space="0" w:color="000000"/>
+            </w:tcBorders>
+            <w:vAlign w:val="center"/>
+          </w:tcPr>
+          <w:p>
+            <w:pPr>
+              <w:pStyle w:val="Style16"/>
+              <w:spacing w:lineRule="auto" w:line="240"/>
+              <w:ind w:hanging="0" w:left="0" w:right="0"/>
+              <w:rPr>
+                <w:sz w:val="24"/>
+                <w:szCs w:val="24"/>
+              </w:rPr>
+            </w:pPr>
+            <w:r>
+              <w:rPr>
+                <w:sz w:val="24"/>
+                <w:szCs w:val="24"/>
+              </w:rPr>
+              <w:t>adoption-of-the-budget-resolution=y physician-fee-freeze=n 219 ==&gt; Class=democrat 219</w:t>
+            </w:r>
+          </w:p>
+        </w:tc>
+        <w:tc>
+          <w:tcPr>
+            <w:tcW w:w="1466" w:type="dxa"/>
+            <w:tcBorders>
+              <w:left w:val="single" w:sz="4" w:space="0" w:color="000000"/>
+              <w:bottom w:val="single" w:sz="4" w:space="0" w:color="000000"/>
+              <w:right w:val="single" w:sz="4" w:space="0" w:color="000000"/>
+            </w:tcBorders>
+            <w:vAlign w:val="center"/>
+          </w:tcPr>
+          <w:p>
+            <w:pPr>
+              <w:pStyle w:val="Style16"/>
+              <w:spacing w:lineRule="auto" w:line="240"/>
+              <w:ind w:hanging="0" w:left="0" w:right="0"/>
+              <w:rPr>
+                <w:sz w:val="24"/>
+                <w:szCs w:val="24"/>
+              </w:rPr>
+            </w:pPr>
+            <w:r>
+              <w:rPr>
+                <w:sz w:val="24"/>
+                <w:szCs w:val="24"/>
+              </w:rPr>
+              <w:t>1</w:t>
+            </w:r>
+          </w:p>
+        </w:tc>
+      </w:tr>
+      <w:tr>
+        <w:trPr/>
+        <w:tc>
+          <w:tcPr>
+            <w:tcW w:w="372" w:type="dxa"/>
+            <w:tcBorders>
+              <w:left w:val="single" w:sz="4" w:space="0" w:color="000000"/>
+              <w:bottom w:val="single" w:sz="4" w:space="0" w:color="000000"/>
+            </w:tcBorders>
+            <w:vAlign w:val="center"/>
+          </w:tcPr>
+          <w:p>
+            <w:pPr>
+              <w:pStyle w:val="Style16"/>
+              <w:spacing w:lineRule="auto" w:line="240"/>
+              <w:ind w:hanging="0" w:left="0" w:right="0"/>
+              <w:rPr>
+                <w:sz w:val="24"/>
+                <w:szCs w:val="24"/>
+              </w:rPr>
+            </w:pPr>
+            <w:r>
+              <w:rPr>
+                <w:sz w:val="24"/>
+                <w:szCs w:val="24"/>
+              </w:rPr>
+              <w:t>2</w:t>
+            </w:r>
+          </w:p>
+        </w:tc>
+        <w:tc>
+          <w:tcPr>
+            <w:tcW w:w="7188" w:type="dxa"/>
+            <w:tcBorders>
+              <w:left w:val="single" w:sz="4" w:space="0" w:color="000000"/>
+              <w:bottom w:val="single" w:sz="4" w:space="0" w:color="000000"/>
+            </w:tcBorders>
+            <w:vAlign w:val="center"/>
+          </w:tcPr>
+          <w:p>
+            <w:pPr>
+              <w:pStyle w:val="Style16"/>
+              <w:spacing w:lineRule="auto" w:line="240"/>
+              <w:ind w:hanging="0" w:left="0" w:right="0"/>
+              <w:rPr>
+                <w:sz w:val="24"/>
+                <w:szCs w:val="24"/>
+              </w:rPr>
+            </w:pPr>
+            <w:r>
+              <w:rPr>
+                <w:sz w:val="24"/>
+                <w:szCs w:val="24"/>
+              </w:rPr>
+              <w:t>adoption-of-the-budget-resolution=y physician-fee-freeze=n aid-to-nicaraguan-contras=y 198 ==&gt; Class=democrat 198</w:t>
+            </w:r>
+          </w:p>
+        </w:tc>
+        <w:tc>
+          <w:tcPr>
+            <w:tcW w:w="1466" w:type="dxa"/>
+            <w:tcBorders>
+              <w:left w:val="single" w:sz="4" w:space="0" w:color="000000"/>
+              <w:bottom w:val="single" w:sz="4" w:space="0" w:color="000000"/>
+              <w:right w:val="single" w:sz="4" w:space="0" w:color="000000"/>
+            </w:tcBorders>
+            <w:vAlign w:val="center"/>
+          </w:tcPr>
+          <w:p>
+            <w:pPr>
+              <w:pStyle w:val="Style16"/>
+              <w:spacing w:lineRule="auto" w:line="240"/>
+              <w:ind w:hanging="0" w:left="0" w:right="0"/>
+              <w:rPr>
+                <w:sz w:val="24"/>
+                <w:szCs w:val="24"/>
+              </w:rPr>
+            </w:pPr>
+            <w:r>
+              <w:rPr>
+                <w:sz w:val="24"/>
+                <w:szCs w:val="24"/>
+              </w:rPr>
+              <w:t>1</w:t>
+            </w:r>
+          </w:p>
+        </w:tc>
+      </w:tr>
+      <w:tr>
+        <w:trPr/>
+        <w:tc>
+          <w:tcPr>
+            <w:tcW w:w="372" w:type="dxa"/>
+            <w:tcBorders>
+              <w:left w:val="single" w:sz="4" w:space="0" w:color="000000"/>
+              <w:bottom w:val="single" w:sz="4" w:space="0" w:color="000000"/>
+            </w:tcBorders>
+            <w:vAlign w:val="center"/>
+          </w:tcPr>
+          <w:p>
+            <w:pPr>
+              <w:pStyle w:val="Style16"/>
+              <w:spacing w:lineRule="auto" w:line="240"/>
+              <w:ind w:hanging="0" w:left="0" w:right="0"/>
+              <w:rPr>
+                <w:sz w:val="24"/>
+                <w:szCs w:val="24"/>
+              </w:rPr>
+            </w:pPr>
+            <w:r>
+              <w:rPr>
+                <w:sz w:val="24"/>
+                <w:szCs w:val="24"/>
+              </w:rPr>
+              <w:t>3</w:t>
+            </w:r>
+          </w:p>
+        </w:tc>
+        <w:tc>
+          <w:tcPr>
+            <w:tcW w:w="7188" w:type="dxa"/>
+            <w:tcBorders>
+              <w:left w:val="single" w:sz="4" w:space="0" w:color="000000"/>
+              <w:bottom w:val="single" w:sz="4" w:space="0" w:color="000000"/>
+            </w:tcBorders>
+            <w:vAlign w:val="center"/>
+          </w:tcPr>
+          <w:p>
+            <w:pPr>
+              <w:pStyle w:val="Style16"/>
+              <w:spacing w:lineRule="auto" w:line="240"/>
+              <w:ind w:hanging="0" w:left="0" w:right="0"/>
+              <w:rPr>
+                <w:sz w:val="24"/>
+                <w:szCs w:val="24"/>
+              </w:rPr>
+            </w:pPr>
+            <w:r>
+              <w:rPr>
+                <w:sz w:val="24"/>
+                <w:szCs w:val="24"/>
+              </w:rPr>
+              <w:t>physician-fee-freeze=n aid-to-nicaraguan-contras=y 211 ==&gt; Class=democrat 210</w:t>
+            </w:r>
+          </w:p>
+        </w:tc>
+        <w:tc>
+          <w:tcPr>
+            <w:tcW w:w="1466" w:type="dxa"/>
+            <w:tcBorders>
+              <w:left w:val="single" w:sz="4" w:space="0" w:color="000000"/>
+              <w:bottom w:val="single" w:sz="4" w:space="0" w:color="000000"/>
+              <w:right w:val="single" w:sz="4" w:space="0" w:color="000000"/>
+            </w:tcBorders>
+            <w:vAlign w:val="center"/>
+          </w:tcPr>
+          <w:p>
+            <w:pPr>
+              <w:pStyle w:val="Style16"/>
+              <w:spacing w:lineRule="auto" w:line="240"/>
+              <w:ind w:hanging="0" w:left="0" w:right="0"/>
+              <w:rPr>
+                <w:sz w:val="24"/>
+                <w:szCs w:val="24"/>
+              </w:rPr>
+            </w:pPr>
+            <w:r>
+              <w:rPr>
+                <w:sz w:val="24"/>
+                <w:szCs w:val="24"/>
+              </w:rPr>
+              <w:t>1</w:t>
+            </w:r>
+          </w:p>
+        </w:tc>
+      </w:tr>
+      <w:tr>
+        <w:trPr/>
+        <w:tc>
+          <w:tcPr>
+            <w:tcW w:w="372" w:type="dxa"/>
+            <w:tcBorders>
+              <w:left w:val="single" w:sz="4" w:space="0" w:color="000000"/>
+              <w:bottom w:val="single" w:sz="4" w:space="0" w:color="000000"/>
+            </w:tcBorders>
+            <w:vAlign w:val="center"/>
+          </w:tcPr>
+          <w:p>
+            <w:pPr>
+              <w:pStyle w:val="Style16"/>
+              <w:spacing w:lineRule="auto" w:line="240"/>
+              <w:ind w:hanging="0" w:left="0" w:right="0"/>
+              <w:rPr>
+                <w:sz w:val="24"/>
+                <w:szCs w:val="24"/>
+              </w:rPr>
+            </w:pPr>
+            <w:r>
+              <w:rPr>
+                <w:sz w:val="24"/>
+                <w:szCs w:val="24"/>
+              </w:rPr>
+              <w:t>4</w:t>
+            </w:r>
+          </w:p>
+        </w:tc>
+        <w:tc>
+          <w:tcPr>
+            <w:tcW w:w="7188" w:type="dxa"/>
+            <w:tcBorders>
+              <w:left w:val="single" w:sz="4" w:space="0" w:color="000000"/>
+              <w:bottom w:val="single" w:sz="4" w:space="0" w:color="000000"/>
+            </w:tcBorders>
+            <w:vAlign w:val="center"/>
+          </w:tcPr>
+          <w:p>
+            <w:pPr>
+              <w:pStyle w:val="Style16"/>
+              <w:spacing w:lineRule="auto" w:line="240"/>
+              <w:ind w:hanging="0" w:left="0" w:right="0"/>
+              <w:rPr>
+                <w:sz w:val="24"/>
+                <w:szCs w:val="24"/>
+              </w:rPr>
+            </w:pPr>
+            <w:r>
+              <w:rPr>
+                <w:sz w:val="24"/>
+                <w:szCs w:val="24"/>
+              </w:rPr>
+              <w:t>physician-fee-freeze=n education-spending=n 202 ==&gt; Class=democrat 201</w:t>
+            </w:r>
+          </w:p>
+        </w:tc>
+        <w:tc>
+          <w:tcPr>
+            <w:tcW w:w="1466" w:type="dxa"/>
+            <w:tcBorders>
+              <w:left w:val="single" w:sz="4" w:space="0" w:color="000000"/>
+              <w:bottom w:val="single" w:sz="4" w:space="0" w:color="000000"/>
+              <w:right w:val="single" w:sz="4" w:space="0" w:color="000000"/>
+            </w:tcBorders>
+            <w:vAlign w:val="center"/>
+          </w:tcPr>
+          <w:p>
+            <w:pPr>
+              <w:pStyle w:val="Style16"/>
+              <w:spacing w:lineRule="auto" w:line="240"/>
+              <w:ind w:hanging="0" w:left="0" w:right="0"/>
+              <w:rPr>
+                <w:sz w:val="24"/>
+                <w:szCs w:val="24"/>
+              </w:rPr>
+            </w:pPr>
+            <w:r>
+              <w:rPr>
+                <w:sz w:val="24"/>
+                <w:szCs w:val="24"/>
+              </w:rPr>
+              <w:t>1</w:t>
+            </w:r>
+          </w:p>
+        </w:tc>
+      </w:tr>
+      <w:tr>
+        <w:trPr/>
+        <w:tc>
+          <w:tcPr>
+            <w:tcW w:w="372" w:type="dxa"/>
+            <w:tcBorders>
+              <w:left w:val="single" w:sz="4" w:space="0" w:color="000000"/>
+              <w:bottom w:val="single" w:sz="4" w:space="0" w:color="000000"/>
+            </w:tcBorders>
+            <w:vAlign w:val="center"/>
+          </w:tcPr>
+          <w:p>
+            <w:pPr>
+              <w:pStyle w:val="Style16"/>
+              <w:spacing w:lineRule="auto" w:line="240"/>
+              <w:ind w:hanging="0" w:left="0" w:right="0"/>
+              <w:rPr>
+                <w:sz w:val="24"/>
+                <w:szCs w:val="24"/>
+              </w:rPr>
+            </w:pPr>
+            <w:r>
+              <w:rPr>
+                <w:sz w:val="24"/>
+                <w:szCs w:val="24"/>
+              </w:rPr>
+              <w:t>5</w:t>
+            </w:r>
+          </w:p>
+        </w:tc>
+        <w:tc>
+          <w:tcPr>
+            <w:tcW w:w="7188" w:type="dxa"/>
+            <w:tcBorders>
+              <w:left w:val="single" w:sz="4" w:space="0" w:color="000000"/>
+              <w:bottom w:val="single" w:sz="4" w:space="0" w:color="000000"/>
+            </w:tcBorders>
+            <w:vAlign w:val="center"/>
+          </w:tcPr>
+          <w:p>
+            <w:pPr>
+              <w:pStyle w:val="Style16"/>
+              <w:spacing w:lineRule="auto" w:line="240"/>
+              <w:ind w:hanging="0" w:left="0" w:right="0"/>
+              <w:rPr>
+                <w:sz w:val="24"/>
+                <w:szCs w:val="24"/>
+              </w:rPr>
+            </w:pPr>
+            <w:r>
+              <w:rPr>
+                <w:sz w:val="24"/>
+                <w:szCs w:val="24"/>
+              </w:rPr>
+              <w:t>physician-fee-freeze=n 247 ==&gt; Class=democrat 245</w:t>
+            </w:r>
+          </w:p>
+        </w:tc>
+        <w:tc>
+          <w:tcPr>
+            <w:tcW w:w="1466" w:type="dxa"/>
+            <w:tcBorders>
+              <w:left w:val="single" w:sz="4" w:space="0" w:color="000000"/>
+              <w:bottom w:val="single" w:sz="4" w:space="0" w:color="000000"/>
+              <w:right w:val="single" w:sz="4" w:space="0" w:color="000000"/>
+            </w:tcBorders>
+            <w:vAlign w:val="center"/>
+          </w:tcPr>
+          <w:p>
+            <w:pPr>
+              <w:pStyle w:val="Style16"/>
+              <w:spacing w:lineRule="auto" w:line="240"/>
+              <w:ind w:hanging="0" w:left="0" w:right="0"/>
+              <w:rPr>
+                <w:sz w:val="24"/>
+                <w:szCs w:val="24"/>
+              </w:rPr>
+            </w:pPr>
+            <w:r>
+              <w:rPr>
+                <w:sz w:val="24"/>
+                <w:szCs w:val="24"/>
+              </w:rPr>
+              <w:t>0.99</w:t>
+            </w:r>
+          </w:p>
+        </w:tc>
+      </w:tr>
+      <w:tr>
+        <w:trPr/>
+        <w:tc>
+          <w:tcPr>
+            <w:tcW w:w="372" w:type="dxa"/>
+            <w:tcBorders>
+              <w:left w:val="single" w:sz="4" w:space="0" w:color="000000"/>
+              <w:bottom w:val="single" w:sz="4" w:space="0" w:color="000000"/>
+            </w:tcBorders>
+            <w:vAlign w:val="center"/>
+          </w:tcPr>
+          <w:p>
+            <w:pPr>
+              <w:pStyle w:val="Style16"/>
+              <w:spacing w:lineRule="auto" w:line="240"/>
+              <w:ind w:hanging="0" w:left="0" w:right="0"/>
+              <w:rPr>
+                <w:sz w:val="24"/>
+                <w:szCs w:val="24"/>
+              </w:rPr>
+            </w:pPr>
+            <w:r>
+              <w:rPr>
+                <w:sz w:val="24"/>
+                <w:szCs w:val="24"/>
+              </w:rPr>
+              <w:t>6</w:t>
+            </w:r>
+          </w:p>
+        </w:tc>
+        <w:tc>
+          <w:tcPr>
+            <w:tcW w:w="7188" w:type="dxa"/>
+            <w:tcBorders>
+              <w:left w:val="single" w:sz="4" w:space="0" w:color="000000"/>
+              <w:bottom w:val="single" w:sz="4" w:space="0" w:color="000000"/>
+            </w:tcBorders>
+            <w:vAlign w:val="center"/>
+          </w:tcPr>
+          <w:p>
+            <w:pPr>
+              <w:pStyle w:val="Style16"/>
+              <w:spacing w:lineRule="auto" w:line="240"/>
+              <w:ind w:hanging="0" w:left="0" w:right="0"/>
+              <w:rPr>
+                <w:sz w:val="24"/>
+                <w:szCs w:val="24"/>
+              </w:rPr>
+            </w:pPr>
+            <w:r>
+              <w:rPr>
+                <w:sz w:val="24"/>
+                <w:szCs w:val="24"/>
+              </w:rPr>
+              <w:t>el-salvador-aid=n Class=democrat 200 ==&gt; aid-to-nicaraguan-contras=y 197</w:t>
+            </w:r>
+          </w:p>
+        </w:tc>
+        <w:tc>
+          <w:tcPr>
+            <w:tcW w:w="1466" w:type="dxa"/>
+            <w:tcBorders>
+              <w:left w:val="single" w:sz="4" w:space="0" w:color="000000"/>
+              <w:bottom w:val="single" w:sz="4" w:space="0" w:color="000000"/>
+              <w:right w:val="single" w:sz="4" w:space="0" w:color="000000"/>
+            </w:tcBorders>
+            <w:vAlign w:val="center"/>
+          </w:tcPr>
+          <w:p>
+            <w:pPr>
+              <w:pStyle w:val="Style16"/>
+              <w:spacing w:lineRule="auto" w:line="240"/>
+              <w:ind w:hanging="0" w:left="0" w:right="0"/>
+              <w:rPr>
+                <w:sz w:val="24"/>
+                <w:szCs w:val="24"/>
+              </w:rPr>
+            </w:pPr>
+            <w:r>
+              <w:rPr>
+                <w:sz w:val="24"/>
+                <w:szCs w:val="24"/>
+              </w:rPr>
+              <w:t>0.98</w:t>
+            </w:r>
+          </w:p>
+        </w:tc>
+      </w:tr>
+      <w:tr>
+        <w:trPr/>
+        <w:tc>
+          <w:tcPr>
+            <w:tcW w:w="372" w:type="dxa"/>
+            <w:tcBorders>
+              <w:left w:val="single" w:sz="4" w:space="0" w:color="000000"/>
+              <w:bottom w:val="single" w:sz="4" w:space="0" w:color="000000"/>
+            </w:tcBorders>
+            <w:vAlign w:val="center"/>
+          </w:tcPr>
+          <w:p>
+            <w:pPr>
+              <w:pStyle w:val="Style16"/>
+              <w:spacing w:lineRule="auto" w:line="240"/>
+              <w:ind w:hanging="0" w:left="0" w:right="0"/>
+              <w:rPr>
+                <w:sz w:val="24"/>
+                <w:szCs w:val="24"/>
+              </w:rPr>
+            </w:pPr>
+            <w:r>
+              <w:rPr>
+                <w:sz w:val="24"/>
+                <w:szCs w:val="24"/>
+              </w:rPr>
+              <w:t>7</w:t>
+            </w:r>
+          </w:p>
+        </w:tc>
+        <w:tc>
+          <w:tcPr>
+            <w:tcW w:w="7188" w:type="dxa"/>
+            <w:tcBorders>
+              <w:left w:val="single" w:sz="4" w:space="0" w:color="000000"/>
+              <w:bottom w:val="single" w:sz="4" w:space="0" w:color="000000"/>
+            </w:tcBorders>
+            <w:vAlign w:val="center"/>
+          </w:tcPr>
+          <w:p>
+            <w:pPr>
+              <w:pStyle w:val="Style16"/>
+              <w:spacing w:lineRule="auto" w:line="240"/>
+              <w:ind w:hanging="0" w:left="0" w:right="0"/>
+              <w:rPr>
+                <w:sz w:val="24"/>
+                <w:szCs w:val="24"/>
+              </w:rPr>
+            </w:pPr>
+            <w:r>
+              <w:rPr>
+                <w:sz w:val="24"/>
+                <w:szCs w:val="24"/>
+              </w:rPr>
+              <w:t>el-salvador-aid=n 208 ==&gt; aid-to-nicaraguan-contras=y 204</w:t>
+            </w:r>
+          </w:p>
+        </w:tc>
+        <w:tc>
+          <w:tcPr>
+            <w:tcW w:w="1466" w:type="dxa"/>
+            <w:tcBorders>
+              <w:left w:val="single" w:sz="4" w:space="0" w:color="000000"/>
+              <w:bottom w:val="single" w:sz="4" w:space="0" w:color="000000"/>
+              <w:right w:val="single" w:sz="4" w:space="0" w:color="000000"/>
+            </w:tcBorders>
+            <w:vAlign w:val="center"/>
+          </w:tcPr>
+          <w:p>
+            <w:pPr>
+              <w:pStyle w:val="Style16"/>
+              <w:spacing w:lineRule="auto" w:line="240"/>
+              <w:ind w:hanging="0" w:left="0" w:right="0"/>
+              <w:rPr>
+                <w:sz w:val="24"/>
+                <w:szCs w:val="24"/>
+              </w:rPr>
+            </w:pPr>
+            <w:r>
+              <w:rPr>
+                <w:sz w:val="24"/>
+                <w:szCs w:val="24"/>
+              </w:rPr>
+              <w:t>0.98</w:t>
+            </w:r>
+          </w:p>
+        </w:tc>
+      </w:tr>
+      <w:tr>
+        <w:trPr/>
+        <w:tc>
+          <w:tcPr>
+            <w:tcW w:w="372" w:type="dxa"/>
+            <w:tcBorders>
+              <w:left w:val="single" w:sz="4" w:space="0" w:color="000000"/>
+              <w:bottom w:val="single" w:sz="4" w:space="0" w:color="000000"/>
+            </w:tcBorders>
+            <w:vAlign w:val="center"/>
+          </w:tcPr>
+          <w:p>
+            <w:pPr>
+              <w:pStyle w:val="Style16"/>
+              <w:spacing w:lineRule="auto" w:line="240"/>
+              <w:ind w:hanging="0" w:left="0" w:right="0"/>
+              <w:rPr>
+                <w:sz w:val="24"/>
+                <w:szCs w:val="24"/>
+              </w:rPr>
+            </w:pPr>
+            <w:r>
+              <w:rPr>
+                <w:sz w:val="24"/>
+                <w:szCs w:val="24"/>
+              </w:rPr>
+              <w:t>8</w:t>
+            </w:r>
+          </w:p>
+        </w:tc>
+        <w:tc>
+          <w:tcPr>
+            <w:tcW w:w="7188" w:type="dxa"/>
+            <w:tcBorders>
+              <w:left w:val="single" w:sz="4" w:space="0" w:color="000000"/>
+              <w:bottom w:val="single" w:sz="4" w:space="0" w:color="000000"/>
+            </w:tcBorders>
+            <w:vAlign w:val="center"/>
+          </w:tcPr>
+          <w:p>
+            <w:pPr>
+              <w:pStyle w:val="Style16"/>
+              <w:spacing w:lineRule="auto" w:line="240"/>
+              <w:ind w:hanging="0" w:left="0" w:right="0"/>
+              <w:rPr>
+                <w:sz w:val="24"/>
+                <w:szCs w:val="24"/>
+              </w:rPr>
+            </w:pPr>
+            <w:r>
+              <w:rPr>
+                <w:sz w:val="24"/>
+                <w:szCs w:val="24"/>
+              </w:rPr>
+              <w:t>adoption-of-the-budget-resolution=y aid-to-nicaraguan-contras=y Class=democrat 203 ==&gt; physician-fee-freeze=n 198</w:t>
+            </w:r>
+          </w:p>
+        </w:tc>
+        <w:tc>
+          <w:tcPr>
+            <w:tcW w:w="1466" w:type="dxa"/>
+            <w:tcBorders>
+              <w:left w:val="single" w:sz="4" w:space="0" w:color="000000"/>
+              <w:bottom w:val="single" w:sz="4" w:space="0" w:color="000000"/>
+              <w:right w:val="single" w:sz="4" w:space="0" w:color="000000"/>
+            </w:tcBorders>
+            <w:vAlign w:val="center"/>
+          </w:tcPr>
+          <w:p>
+            <w:pPr>
+              <w:pStyle w:val="Style16"/>
+              <w:spacing w:lineRule="auto" w:line="240"/>
+              <w:ind w:hanging="0" w:left="0" w:right="0"/>
+              <w:rPr>
+                <w:sz w:val="24"/>
+                <w:szCs w:val="24"/>
+              </w:rPr>
+            </w:pPr>
+            <w:r>
+              <w:rPr>
+                <w:sz w:val="24"/>
+                <w:szCs w:val="24"/>
+              </w:rPr>
+              <w:t>0.98</w:t>
+            </w:r>
+          </w:p>
+        </w:tc>
+      </w:tr>
+      <w:tr>
+        <w:trPr/>
+        <w:tc>
+          <w:tcPr>
+            <w:tcW w:w="372" w:type="dxa"/>
+            <w:tcBorders>
+              <w:left w:val="single" w:sz="4" w:space="0" w:color="000000"/>
+              <w:bottom w:val="single" w:sz="4" w:space="0" w:color="000000"/>
+            </w:tcBorders>
+            <w:vAlign w:val="center"/>
+          </w:tcPr>
+          <w:p>
+            <w:pPr>
+              <w:pStyle w:val="Style16"/>
+              <w:spacing w:lineRule="auto" w:line="240"/>
+              <w:ind w:hanging="0" w:left="0" w:right="0"/>
+              <w:rPr>
+                <w:sz w:val="24"/>
+                <w:szCs w:val="24"/>
+              </w:rPr>
+            </w:pPr>
+            <w:r>
+              <w:rPr>
+                <w:sz w:val="24"/>
+                <w:szCs w:val="24"/>
+              </w:rPr>
+              <w:t>9</w:t>
+            </w:r>
+          </w:p>
+        </w:tc>
+        <w:tc>
+          <w:tcPr>
+            <w:tcW w:w="7188" w:type="dxa"/>
+            <w:tcBorders>
+              <w:left w:val="single" w:sz="4" w:space="0" w:color="000000"/>
+              <w:bottom w:val="single" w:sz="4" w:space="0" w:color="000000"/>
+            </w:tcBorders>
+            <w:vAlign w:val="center"/>
+          </w:tcPr>
+          <w:p>
+            <w:pPr>
+              <w:pStyle w:val="Style16"/>
+              <w:spacing w:lineRule="auto" w:line="240"/>
+              <w:ind w:hanging="0" w:left="0" w:right="0"/>
+              <w:rPr>
+                <w:sz w:val="24"/>
+                <w:szCs w:val="24"/>
+              </w:rPr>
+            </w:pPr>
+            <w:r>
+              <w:rPr>
+                <w:sz w:val="24"/>
+                <w:szCs w:val="24"/>
+              </w:rPr>
+              <w:t>el-salvador-aid=n aid-to-nicaraguan-contras=y 204 ==&gt; Class=democrat 197</w:t>
+            </w:r>
+          </w:p>
+        </w:tc>
+        <w:tc>
+          <w:tcPr>
+            <w:tcW w:w="1466" w:type="dxa"/>
+            <w:tcBorders>
+              <w:left w:val="single" w:sz="4" w:space="0" w:color="000000"/>
+              <w:bottom w:val="single" w:sz="4" w:space="0" w:color="000000"/>
+              <w:right w:val="single" w:sz="4" w:space="0" w:color="000000"/>
+            </w:tcBorders>
+            <w:vAlign w:val="center"/>
+          </w:tcPr>
+          <w:p>
+            <w:pPr>
+              <w:pStyle w:val="Style16"/>
+              <w:spacing w:lineRule="auto" w:line="240"/>
+              <w:ind w:hanging="0" w:left="0" w:right="0"/>
+              <w:rPr>
+                <w:sz w:val="24"/>
+                <w:szCs w:val="24"/>
+              </w:rPr>
+            </w:pPr>
+            <w:r>
+              <w:rPr>
+                <w:sz w:val="24"/>
+                <w:szCs w:val="24"/>
+              </w:rPr>
+              <w:t>0.97</w:t>
+            </w:r>
+          </w:p>
+        </w:tc>
+      </w:tr>
+      <w:tr>
+        <w:trPr/>
+        <w:tc>
+          <w:tcPr>
+            <w:tcW w:w="372" w:type="dxa"/>
+            <w:tcBorders>
+              <w:left w:val="single" w:sz="4" w:space="0" w:color="000000"/>
+              <w:bottom w:val="single" w:sz="4" w:space="0" w:color="000000"/>
+            </w:tcBorders>
+            <w:vAlign w:val="center"/>
+          </w:tcPr>
+          <w:p>
+            <w:pPr>
+              <w:pStyle w:val="Style16"/>
+              <w:spacing w:lineRule="auto" w:line="240"/>
+              <w:ind w:hanging="0" w:left="0" w:right="0"/>
+              <w:rPr>
+                <w:sz w:val="24"/>
+                <w:szCs w:val="24"/>
+              </w:rPr>
+            </w:pPr>
+            <w:r>
+              <w:rPr>
+                <w:sz w:val="24"/>
+                <w:szCs w:val="24"/>
+              </w:rPr>
+              <w:t>10</w:t>
+            </w:r>
+          </w:p>
+        </w:tc>
+        <w:tc>
+          <w:tcPr>
+            <w:tcW w:w="7188" w:type="dxa"/>
+            <w:tcBorders>
+              <w:left w:val="single" w:sz="4" w:space="0" w:color="000000"/>
+              <w:bottom w:val="single" w:sz="4" w:space="0" w:color="000000"/>
+            </w:tcBorders>
+            <w:vAlign w:val="center"/>
+          </w:tcPr>
+          <w:p>
+            <w:pPr>
+              <w:pStyle w:val="Style16"/>
+              <w:spacing w:lineRule="auto" w:line="240"/>
+              <w:ind w:hanging="0" w:left="0" w:right="0"/>
+              <w:rPr>
+                <w:sz w:val="24"/>
+                <w:szCs w:val="24"/>
+              </w:rPr>
+            </w:pPr>
+            <w:r>
+              <w:rPr>
+                <w:sz w:val="24"/>
+                <w:szCs w:val="24"/>
+              </w:rPr>
+              <w:t>aid-to-nicaraguan-contras=y Class=democrat 218 ==&gt; physician-fee-freeze=n 210</w:t>
+            </w:r>
+          </w:p>
+        </w:tc>
+        <w:tc>
+          <w:tcPr>
+            <w:tcW w:w="1466" w:type="dxa"/>
+            <w:tcBorders>
+              <w:left w:val="single" w:sz="4" w:space="0" w:color="000000"/>
+              <w:bottom w:val="single" w:sz="4" w:space="0" w:color="000000"/>
+              <w:right w:val="single" w:sz="4" w:space="0" w:color="000000"/>
+            </w:tcBorders>
+            <w:vAlign w:val="center"/>
+          </w:tcPr>
+          <w:p>
+            <w:pPr>
+              <w:pStyle w:val="Style16"/>
+              <w:spacing w:lineRule="auto" w:line="240"/>
+              <w:ind w:hanging="0" w:left="0"/>
+              <w:rPr>
+                <w:sz w:val="24"/>
+                <w:szCs w:val="24"/>
+              </w:rPr>
+            </w:pPr>
+            <w:r>
+              <w:rPr>
+                <w:sz w:val="24"/>
+                <w:szCs w:val="24"/>
+              </w:rPr>
+              <w:t>0.96</w:t>
+            </w:r>
+          </w:p>
+        </w:tc>
+      </w:tr>
+    </w:tbl>
+    <w:p>
+      <w:pPr>
+        <w:pStyle w:val="p11"/>
+        <w:rPr>
+          <w:lang w:val="uk-UA"/>
+        </w:rPr>
+      </w:pPr>
+      <w:r>
+        <w:rPr>
+          <w:lang w:val="uk-UA"/>
+        </w:rPr>
+      </w:r>
+    </w:p>
+    <w:p>
+      <w:pPr>
+        <w:pStyle w:val="H2"/>
+        <w:rPr/>
+      </w:pPr>
+      <w:r>
+        <w:rPr/>
+        <w:t xml:space="preserve">5 </w:t>
+      </w:r>
+      <w:r>
+        <w:rPr/>
+        <w:t>А</w:t>
+      </w:r>
+      <w:r>
+        <w:rPr/>
+        <w:t>лгоритм пошуку асоціативних правил FPGrowth</w:t>
+      </w:r>
+    </w:p>
+    <w:p>
+      <w:pPr>
+        <w:pStyle w:val="P1"/>
+        <w:rPr/>
+      </w:pPr>
+      <w:r>
+        <w:rPr/>
+      </w:r>
+    </w:p>
+    <w:p>
+      <w:pPr>
+        <w:pStyle w:val="P1"/>
+        <w:rPr/>
+      </w:pPr>
+      <w:r>
+        <w:rPr/>
+        <w:t xml:space="preserve">Запущено алгоритм </w:t>
       </w:r>
       <w:r>
         <w:rPr>
           <w:lang w:val="en-US"/>
         </w:rPr>
-        <w:t xml:space="preserve">vote.arff </w:t>
+        <w:t xml:space="preserve">FPGrowth. </w:t>
       </w:r>
       <w:r>
         <w:rPr>
           <w:lang w:val="uk-UA"/>
         </w:rPr>
-        <w:t>завантажено.</w:t>
+        <w:t>Деталі на картинці нижче:</w:t>
+      </w:r>
+    </w:p>
+    <w:p>
+      <w:pPr>
+        <w:pStyle w:val="IMG1"/>
+        <w:rPr/>
+      </w:pPr>
+      <w:r>
+        <w:rPr/>
+      </w:r>
+    </w:p>
+    <w:p>
+      <w:pPr>
+        <w:pStyle w:val="IMG1"/>
+        <w:rPr/>
+      </w:pPr>
+      <w:r>
+        <w:rPr/>
+        <w:drawing>
+          <wp:inline distT="0" distB="0" distL="0" distR="0">
+            <wp:extent cx="5731510" cy="6268720"/>
+            <wp:effectExtent l="0" t="0" r="0" b="0"/>
+            <wp:docPr id="3" name="Зображення3"/>
+            <wp:cNvGraphicFramePr>
+              <a:graphicFrameLocks xmlns:a="http://schemas.openxmlformats.org/drawingml/2006/main" noChangeAspect="1"/>
+            </wp:cNvGraphicFramePr>
+            <a:graphic xmlns:a="http://schemas.openxmlformats.org/drawingml/2006/main">
+              <a:graphicData uri="http://schemas.openxmlformats.org/drawingml/2006/picture">
+                <pic:pic xmlns:pic="http://schemas.openxmlformats.org/drawingml/2006/picture">
+                  <pic:nvPicPr>
+                    <pic:cNvPr id="3" name="Зображення3"/>
+                    <pic:cNvPicPr>
+                      <a:picLocks noChangeAspect="1" noChangeArrowheads="1"/>
+                    </pic:cNvPicPr>
+                  </pic:nvPicPr>
+                  <pic:blipFill>
+                    <a:blip r:embed="rId4"/>
+                    <a:stretch>
+                      <a:fillRect/>
+                    </a:stretch>
+                  </pic:blipFill>
+                  <pic:spPr bwMode="auto">
+                    <a:xfrm>
+                      <a:off x="0" y="0"/>
+                      <a:ext cx="5731510" cy="6268720"/>
+                    </a:xfrm>
+                    <a:prstGeom prst="rect">
+                      <a:avLst/>
+                    </a:prstGeom>
+                    <a:noFill/>
+                  </pic:spPr>
+                </pic:pic>
+              </a:graphicData>
+            </a:graphic>
+          </wp:inline>
+        </w:drawing>
+      </w:r>
+    </w:p>
+    <w:p>
+      <w:pPr>
+        <w:pStyle w:val="IMG1"/>
+        <w:rPr/>
+      </w:pPr>
+      <w:r>
+        <w:rPr/>
+        <w:t>Рисунок 5.1 — Вигляд результатів алгоритму</w:t>
+      </w:r>
+    </w:p>
+    <w:p>
+      <w:pPr>
+        <w:pStyle w:val="P1"/>
+        <w:rPr/>
+      </w:pPr>
+      <w:r>
+        <w:rPr/>
+      </w:r>
+    </w:p>
+    <w:p>
+      <w:pPr>
+        <w:pStyle w:val="H2"/>
+        <w:rPr/>
+      </w:pPr>
+      <w:r>
+        <w:rPr/>
+        <w:t xml:space="preserve">6 </w:t>
+      </w:r>
+      <w:r>
+        <w:rPr/>
+        <w:t>П</w:t>
+      </w:r>
+      <w:r>
+        <w:rPr/>
+        <w:t xml:space="preserve">орівняти </w:t>
+      </w:r>
+      <w:r>
+        <w:rPr/>
+        <w:t xml:space="preserve">списків </w:t>
+      </w:r>
+      <w:r>
+        <w:rPr/>
+        <w:t>десяти правил</w:t>
+      </w:r>
+    </w:p>
+    <w:p>
+      <w:pPr>
+        <w:pStyle w:val="p11"/>
+        <w:rPr>
+          <w:lang w:val="uk-UA"/>
+        </w:rPr>
+      </w:pPr>
+      <w:r>
+        <w:rPr>
+          <w:lang w:val="uk-UA"/>
+        </w:rPr>
+      </w:r>
+    </w:p>
+    <w:p>
+      <w:pPr>
+        <w:pStyle w:val="p11"/>
+        <w:rPr>
+          <w:lang w:val="uk-UA"/>
+        </w:rPr>
+      </w:pPr>
+      <w:r>
+        <w:rPr>
+          <w:lang w:val="uk-UA"/>
+        </w:rPr>
+        <w:t xml:space="preserve">Алгоритм </w:t>
+      </w:r>
+      <w:r>
+        <w:rPr>
+          <w:lang w:val="en-US"/>
+        </w:rPr>
+        <w:t xml:space="preserve">FPGrowth </w:t>
+      </w:r>
+      <w:r>
+        <w:rPr>
+          <w:lang w:val="uk-UA"/>
+        </w:rPr>
+        <w:t>базується на деревах.</w:t>
+      </w:r>
+    </w:p>
+    <w:p>
+      <w:pPr>
+        <w:pStyle w:val="p11"/>
+        <w:rPr>
+          <w:lang w:val="uk-UA"/>
+        </w:rPr>
+      </w:pPr>
+      <w:r>
+        <w:rPr>
+          <w:lang w:val="uk-UA"/>
+        </w:rPr>
+        <w:t>Нижче на таблиці наведено найкращі правила:</w:t>
+      </w:r>
+    </w:p>
+    <w:p>
+      <w:pPr>
+        <w:pStyle w:val="p11"/>
+        <w:rPr>
+          <w:lang w:val="uk-UA"/>
+        </w:rPr>
+      </w:pPr>
+      <w:r>
+        <w:rPr>
+          <w:lang w:val="uk-UA"/>
+        </w:rPr>
+      </w:r>
+    </w:p>
+    <w:p>
+      <w:pPr>
+        <w:pStyle w:val="p11"/>
+        <w:rPr>
+          <w:lang w:val="uk-UA"/>
+        </w:rPr>
+      </w:pPr>
+      <w:r>
+        <w:rPr>
+          <w:lang w:val="uk-UA"/>
+        </w:rPr>
+        <w:t>Таблиця 6.1 — Десять найкращих правил</w:t>
+      </w:r>
+    </w:p>
+    <w:tbl>
+      <w:tblPr>
+        <w:tblW w:w="9026" w:type="dxa"/>
+        <w:jc w:val="left"/>
+        <w:tblInd w:w="55" w:type="dxa"/>
+        <w:tblLayout w:type="fixed"/>
+        <w:tblCellMar>
+          <w:top w:w="55" w:type="dxa"/>
+          <w:left w:w="55" w:type="dxa"/>
+          <w:bottom w:w="55" w:type="dxa"/>
+          <w:right w:w="55" w:type="dxa"/>
+        </w:tblCellMar>
+      </w:tblPr>
+      <w:tblGrid>
+        <w:gridCol w:w="372"/>
+        <w:gridCol w:w="7188"/>
+        <w:gridCol w:w="1466"/>
+      </w:tblGrid>
+      <w:tr>
+        <w:trPr>
+          <w:tblHeader w:val="true"/>
+        </w:trPr>
+        <w:tc>
+          <w:tcPr>
+            <w:tcW w:w="372" w:type="dxa"/>
+            <w:tcBorders>
+              <w:top w:val="single" w:sz="4" w:space="0" w:color="000000"/>
+              <w:left w:val="single" w:sz="4" w:space="0" w:color="000000"/>
+              <w:bottom w:val="single" w:sz="4" w:space="0" w:color="000000"/>
+            </w:tcBorders>
+            <w:vAlign w:val="center"/>
+          </w:tcPr>
+          <w:p>
+            <w:pPr>
+              <w:pStyle w:val="Style17"/>
+              <w:spacing w:lineRule="auto" w:line="240"/>
+              <w:ind w:hanging="0" w:left="0" w:right="0"/>
+              <w:jc w:val="left"/>
+              <w:rPr>
+                <w:sz w:val="24"/>
+                <w:szCs w:val="24"/>
+              </w:rPr>
+            </w:pPr>
+            <w:r>
+              <w:rPr>
+                <w:sz w:val="24"/>
+                <w:szCs w:val="24"/>
+              </w:rPr>
+              <w:t>№</w:t>
+            </w:r>
+          </w:p>
+        </w:tc>
+        <w:tc>
+          <w:tcPr>
+            <w:tcW w:w="7188" w:type="dxa"/>
+            <w:tcBorders>
+              <w:top w:val="single" w:sz="4" w:space="0" w:color="000000"/>
+              <w:left w:val="single" w:sz="4" w:space="0" w:color="000000"/>
+              <w:bottom w:val="single" w:sz="4" w:space="0" w:color="000000"/>
+            </w:tcBorders>
+            <w:vAlign w:val="center"/>
+          </w:tcPr>
+          <w:p>
+            <w:pPr>
+              <w:pStyle w:val="Style17"/>
+              <w:spacing w:lineRule="auto" w:line="240"/>
+              <w:ind w:hanging="0" w:left="0" w:right="0"/>
+              <w:jc w:val="left"/>
+              <w:rPr>
+                <w:sz w:val="24"/>
+                <w:szCs w:val="24"/>
+              </w:rPr>
+            </w:pPr>
+            <w:r>
+              <w:rPr>
+                <w:sz w:val="24"/>
+                <w:szCs w:val="24"/>
+              </w:rPr>
+              <w:t>Правило</w:t>
+            </w:r>
+          </w:p>
+        </w:tc>
+        <w:tc>
+          <w:tcPr>
+            <w:tcW w:w="1466" w:type="dxa"/>
+            <w:tcBorders>
+              <w:top w:val="single" w:sz="4" w:space="0" w:color="000000"/>
+              <w:left w:val="single" w:sz="4" w:space="0" w:color="000000"/>
+              <w:bottom w:val="single" w:sz="4" w:space="0" w:color="000000"/>
+              <w:right w:val="single" w:sz="4" w:space="0" w:color="000000"/>
+            </w:tcBorders>
+            <w:vAlign w:val="center"/>
+          </w:tcPr>
+          <w:p>
+            <w:pPr>
+              <w:pStyle w:val="Style17"/>
+              <w:spacing w:lineRule="auto" w:line="240"/>
+              <w:ind w:hanging="0" w:left="0" w:right="0"/>
+              <w:jc w:val="left"/>
+              <w:rPr>
+                <w:sz w:val="24"/>
+                <w:szCs w:val="24"/>
+              </w:rPr>
+            </w:pPr>
+            <w:r>
+              <w:rPr>
+                <w:sz w:val="24"/>
+                <w:szCs w:val="24"/>
+              </w:rPr>
+              <w:t>Впевненість</w:t>
+            </w:r>
+          </w:p>
+        </w:tc>
+      </w:tr>
+      <w:tr>
+        <w:trPr/>
+        <w:tc>
+          <w:tcPr>
+            <w:tcW w:w="372" w:type="dxa"/>
+            <w:tcBorders>
+              <w:left w:val="single" w:sz="4" w:space="0" w:color="000000"/>
+              <w:bottom w:val="single" w:sz="4" w:space="0" w:color="000000"/>
+            </w:tcBorders>
+            <w:vAlign w:val="center"/>
+          </w:tcPr>
+          <w:p>
+            <w:pPr>
+              <w:pStyle w:val="Style16"/>
+              <w:spacing w:lineRule="auto" w:line="240"/>
+              <w:ind w:hanging="0" w:left="0" w:right="0"/>
+              <w:rPr>
+                <w:sz w:val="24"/>
+                <w:szCs w:val="24"/>
+              </w:rPr>
+            </w:pPr>
+            <w:r>
+              <w:rPr>
+                <w:sz w:val="24"/>
+                <w:szCs w:val="24"/>
+              </w:rPr>
+              <w:t>1</w:t>
+            </w:r>
+          </w:p>
+        </w:tc>
+        <w:tc>
+          <w:tcPr>
+            <w:tcW w:w="7188" w:type="dxa"/>
+            <w:tcBorders>
+              <w:left w:val="single" w:sz="4" w:space="0" w:color="000000"/>
+              <w:bottom w:val="single" w:sz="4" w:space="0" w:color="000000"/>
+            </w:tcBorders>
+            <w:vAlign w:val="center"/>
+          </w:tcPr>
+          <w:p>
+            <w:pPr>
+              <w:pStyle w:val="Style16"/>
+              <w:spacing w:lineRule="auto" w:line="240"/>
+              <w:ind w:hanging="0" w:left="0" w:right="0"/>
+              <w:rPr>
+                <w:sz w:val="24"/>
+                <w:szCs w:val="24"/>
+              </w:rPr>
+            </w:pPr>
+            <w:r>
+              <w:rPr>
+                <w:sz w:val="24"/>
+                <w:szCs w:val="24"/>
+              </w:rPr>
+              <w:t>[el-salvador-aid=y, Class=republican]: 157 ==&gt; [physician-fee-freeze=y]:</w:t>
+            </w:r>
+          </w:p>
+        </w:tc>
+        <w:tc>
+          <w:tcPr>
+            <w:tcW w:w="1466" w:type="dxa"/>
+            <w:tcBorders>
+              <w:left w:val="single" w:sz="4" w:space="0" w:color="000000"/>
+              <w:bottom w:val="single" w:sz="4" w:space="0" w:color="000000"/>
+              <w:right w:val="single" w:sz="4" w:space="0" w:color="000000"/>
+            </w:tcBorders>
+            <w:vAlign w:val="center"/>
+          </w:tcPr>
+          <w:p>
+            <w:pPr>
+              <w:pStyle w:val="Style16"/>
+              <w:spacing w:lineRule="auto" w:line="240"/>
+              <w:ind w:hanging="0" w:left="0" w:right="0"/>
+              <w:rPr>
+                <w:sz w:val="24"/>
+                <w:szCs w:val="24"/>
+              </w:rPr>
+            </w:pPr>
+            <w:r>
+              <w:rPr>
+                <w:sz w:val="24"/>
+                <w:szCs w:val="24"/>
+              </w:rPr>
+              <w:t>0.99</w:t>
+            </w:r>
+          </w:p>
+        </w:tc>
+      </w:tr>
+      <w:tr>
+        <w:trPr/>
+        <w:tc>
+          <w:tcPr>
+            <w:tcW w:w="372" w:type="dxa"/>
+            <w:tcBorders>
+              <w:left w:val="single" w:sz="4" w:space="0" w:color="000000"/>
+              <w:bottom w:val="single" w:sz="4" w:space="0" w:color="000000"/>
+            </w:tcBorders>
+            <w:vAlign w:val="center"/>
+          </w:tcPr>
+          <w:p>
+            <w:pPr>
+              <w:pStyle w:val="Style16"/>
+              <w:spacing w:lineRule="auto" w:line="240"/>
+              <w:ind w:hanging="0" w:left="0" w:right="0"/>
+              <w:rPr>
+                <w:sz w:val="24"/>
+                <w:szCs w:val="24"/>
+              </w:rPr>
+            </w:pPr>
+            <w:r>
+              <w:rPr>
+                <w:sz w:val="24"/>
+                <w:szCs w:val="24"/>
+              </w:rPr>
+              <w:t>2</w:t>
+            </w:r>
+          </w:p>
+        </w:tc>
+        <w:tc>
+          <w:tcPr>
+            <w:tcW w:w="7188" w:type="dxa"/>
+            <w:tcBorders>
+              <w:left w:val="single" w:sz="4" w:space="0" w:color="000000"/>
+              <w:bottom w:val="single" w:sz="4" w:space="0" w:color="000000"/>
+            </w:tcBorders>
+            <w:vAlign w:val="center"/>
+          </w:tcPr>
+          <w:p>
+            <w:pPr>
+              <w:pStyle w:val="Style16"/>
+              <w:spacing w:lineRule="auto" w:line="240"/>
+              <w:ind w:hanging="0" w:left="0" w:right="0"/>
+              <w:rPr>
+                <w:sz w:val="24"/>
+                <w:szCs w:val="24"/>
+              </w:rPr>
+            </w:pPr>
+            <w:r>
+              <w:rPr>
+                <w:sz w:val="24"/>
+                <w:szCs w:val="24"/>
+              </w:rPr>
+              <w:t>[crime=y, Class=republican]: 158 ==&gt; [physician-fee-freeze=y]:</w:t>
+            </w:r>
+          </w:p>
+        </w:tc>
+        <w:tc>
+          <w:tcPr>
+            <w:tcW w:w="1466" w:type="dxa"/>
+            <w:tcBorders>
+              <w:left w:val="single" w:sz="4" w:space="0" w:color="000000"/>
+              <w:bottom w:val="single" w:sz="4" w:space="0" w:color="000000"/>
+              <w:right w:val="single" w:sz="4" w:space="0" w:color="000000"/>
+            </w:tcBorders>
+            <w:vAlign w:val="center"/>
+          </w:tcPr>
+          <w:p>
+            <w:pPr>
+              <w:pStyle w:val="Style16"/>
+              <w:spacing w:lineRule="auto" w:line="240"/>
+              <w:ind w:hanging="0" w:left="0" w:right="0"/>
+              <w:rPr>
+                <w:sz w:val="24"/>
+                <w:szCs w:val="24"/>
+              </w:rPr>
+            </w:pPr>
+            <w:r>
+              <w:rPr>
+                <w:sz w:val="24"/>
+                <w:szCs w:val="24"/>
+              </w:rPr>
+              <w:t>0.98</w:t>
+            </w:r>
+          </w:p>
+        </w:tc>
+      </w:tr>
+      <w:tr>
+        <w:trPr/>
+        <w:tc>
+          <w:tcPr>
+            <w:tcW w:w="372" w:type="dxa"/>
+            <w:tcBorders>
+              <w:left w:val="single" w:sz="4" w:space="0" w:color="000000"/>
+              <w:bottom w:val="single" w:sz="4" w:space="0" w:color="000000"/>
+            </w:tcBorders>
+            <w:vAlign w:val="center"/>
+          </w:tcPr>
+          <w:p>
+            <w:pPr>
+              <w:pStyle w:val="Style16"/>
+              <w:spacing w:lineRule="auto" w:line="240"/>
+              <w:ind w:hanging="0" w:left="0" w:right="0"/>
+              <w:rPr>
+                <w:sz w:val="24"/>
+                <w:szCs w:val="24"/>
+              </w:rPr>
+            </w:pPr>
+            <w:r>
+              <w:rPr>
+                <w:sz w:val="24"/>
+                <w:szCs w:val="24"/>
+              </w:rPr>
+              <w:t>3</w:t>
+            </w:r>
+          </w:p>
+        </w:tc>
+        <w:tc>
+          <w:tcPr>
+            <w:tcW w:w="7188" w:type="dxa"/>
+            <w:tcBorders>
+              <w:left w:val="single" w:sz="4" w:space="0" w:color="000000"/>
+              <w:bottom w:val="single" w:sz="4" w:space="0" w:color="000000"/>
+            </w:tcBorders>
+            <w:vAlign w:val="center"/>
+          </w:tcPr>
+          <w:p>
+            <w:pPr>
+              <w:pStyle w:val="Style16"/>
+              <w:spacing w:lineRule="auto" w:line="240"/>
+              <w:ind w:hanging="0" w:left="0" w:right="0"/>
+              <w:rPr>
+                <w:sz w:val="24"/>
+                <w:szCs w:val="24"/>
+              </w:rPr>
+            </w:pPr>
+            <w:r>
+              <w:rPr>
+                <w:sz w:val="24"/>
+                <w:szCs w:val="24"/>
+              </w:rPr>
+              <w:t>[religious-groups-in-schools=y, physician-fee-freeze=y]: 160 ==&gt; [el-salvador-aid=y]:</w:t>
+            </w:r>
+          </w:p>
+        </w:tc>
+        <w:tc>
+          <w:tcPr>
+            <w:tcW w:w="1466" w:type="dxa"/>
+            <w:tcBorders>
+              <w:left w:val="single" w:sz="4" w:space="0" w:color="000000"/>
+              <w:bottom w:val="single" w:sz="4" w:space="0" w:color="000000"/>
+              <w:right w:val="single" w:sz="4" w:space="0" w:color="000000"/>
+            </w:tcBorders>
+            <w:vAlign w:val="center"/>
+          </w:tcPr>
+          <w:p>
+            <w:pPr>
+              <w:pStyle w:val="Style16"/>
+              <w:spacing w:lineRule="auto" w:line="240"/>
+              <w:ind w:hanging="0" w:left="0" w:right="0"/>
+              <w:rPr>
+                <w:sz w:val="24"/>
+                <w:szCs w:val="24"/>
+              </w:rPr>
+            </w:pPr>
+            <w:r>
+              <w:rPr>
+                <w:sz w:val="24"/>
+                <w:szCs w:val="24"/>
+              </w:rPr>
+              <w:t>0.97</w:t>
+            </w:r>
+          </w:p>
+        </w:tc>
+      </w:tr>
+      <w:tr>
+        <w:trPr/>
+        <w:tc>
+          <w:tcPr>
+            <w:tcW w:w="372" w:type="dxa"/>
+            <w:tcBorders>
+              <w:left w:val="single" w:sz="4" w:space="0" w:color="000000"/>
+              <w:bottom w:val="single" w:sz="4" w:space="0" w:color="000000"/>
+            </w:tcBorders>
+            <w:vAlign w:val="center"/>
+          </w:tcPr>
+          <w:p>
+            <w:pPr>
+              <w:pStyle w:val="Style16"/>
+              <w:spacing w:lineRule="auto" w:line="240"/>
+              <w:ind w:hanging="0" w:left="0" w:right="0"/>
+              <w:rPr>
+                <w:sz w:val="24"/>
+                <w:szCs w:val="24"/>
+              </w:rPr>
+            </w:pPr>
+            <w:r>
+              <w:rPr>
+                <w:sz w:val="24"/>
+                <w:szCs w:val="24"/>
+              </w:rPr>
+              <w:t>4</w:t>
+            </w:r>
+          </w:p>
+        </w:tc>
+        <w:tc>
+          <w:tcPr>
+            <w:tcW w:w="7188" w:type="dxa"/>
+            <w:tcBorders>
+              <w:left w:val="single" w:sz="4" w:space="0" w:color="000000"/>
+              <w:bottom w:val="single" w:sz="4" w:space="0" w:color="000000"/>
+            </w:tcBorders>
+            <w:vAlign w:val="center"/>
+          </w:tcPr>
+          <w:p>
+            <w:pPr>
+              <w:pStyle w:val="Style16"/>
+              <w:spacing w:lineRule="auto" w:line="240"/>
+              <w:ind w:hanging="0" w:left="0" w:right="0"/>
+              <w:rPr>
+                <w:sz w:val="24"/>
+                <w:szCs w:val="24"/>
+              </w:rPr>
+            </w:pPr>
+            <w:r>
+              <w:rPr>
+                <w:sz w:val="24"/>
+                <w:szCs w:val="24"/>
+              </w:rPr>
+              <w:t>[Class=republican]: 168 ==&gt; [physician-fee-freeze=y]:</w:t>
+            </w:r>
+          </w:p>
+        </w:tc>
+        <w:tc>
+          <w:tcPr>
+            <w:tcW w:w="1466" w:type="dxa"/>
+            <w:tcBorders>
+              <w:left w:val="single" w:sz="4" w:space="0" w:color="000000"/>
+              <w:bottom w:val="single" w:sz="4" w:space="0" w:color="000000"/>
+              <w:right w:val="single" w:sz="4" w:space="0" w:color="000000"/>
+            </w:tcBorders>
+            <w:vAlign w:val="center"/>
+          </w:tcPr>
+          <w:p>
+            <w:pPr>
+              <w:pStyle w:val="Style16"/>
+              <w:spacing w:lineRule="auto" w:line="240"/>
+              <w:ind w:hanging="0" w:left="0" w:right="0"/>
+              <w:rPr>
+                <w:sz w:val="24"/>
+                <w:szCs w:val="24"/>
+              </w:rPr>
+            </w:pPr>
+            <w:r>
+              <w:rPr>
+                <w:sz w:val="24"/>
+                <w:szCs w:val="24"/>
+              </w:rPr>
+              <w:t>0.97</w:t>
+            </w:r>
+          </w:p>
+        </w:tc>
+      </w:tr>
+      <w:tr>
+        <w:trPr/>
+        <w:tc>
+          <w:tcPr>
+            <w:tcW w:w="372" w:type="dxa"/>
+            <w:tcBorders>
+              <w:left w:val="single" w:sz="4" w:space="0" w:color="000000"/>
+              <w:bottom w:val="single" w:sz="4" w:space="0" w:color="000000"/>
+            </w:tcBorders>
+            <w:vAlign w:val="center"/>
+          </w:tcPr>
+          <w:p>
+            <w:pPr>
+              <w:pStyle w:val="Style16"/>
+              <w:spacing w:lineRule="auto" w:line="240"/>
+              <w:ind w:hanging="0" w:left="0" w:right="0"/>
+              <w:rPr>
+                <w:sz w:val="24"/>
+                <w:szCs w:val="24"/>
+              </w:rPr>
+            </w:pPr>
+            <w:r>
+              <w:rPr>
+                <w:sz w:val="24"/>
+                <w:szCs w:val="24"/>
+              </w:rPr>
+              <w:t>5</w:t>
+            </w:r>
+          </w:p>
+        </w:tc>
+        <w:tc>
+          <w:tcPr>
+            <w:tcW w:w="7188" w:type="dxa"/>
+            <w:tcBorders>
+              <w:left w:val="single" w:sz="4" w:space="0" w:color="000000"/>
+              <w:bottom w:val="single" w:sz="4" w:space="0" w:color="000000"/>
+            </w:tcBorders>
+            <w:vAlign w:val="center"/>
+          </w:tcPr>
+          <w:p>
+            <w:pPr>
+              <w:pStyle w:val="Style16"/>
+              <w:spacing w:lineRule="auto" w:line="240"/>
+              <w:ind w:hanging="0" w:left="0" w:right="0"/>
+              <w:rPr>
+                <w:sz w:val="24"/>
+                <w:szCs w:val="24"/>
+              </w:rPr>
+            </w:pPr>
+            <w:r>
+              <w:rPr>
+                <w:sz w:val="24"/>
+                <w:szCs w:val="24"/>
+              </w:rPr>
+              <w:t>[adoption-of-the-budget-resolution=y, anti-satellite-test-ban=y, mx-missile=y]: 161 ==&gt; [aid-to-nicaraguan-contras=y]:</w:t>
+            </w:r>
+          </w:p>
+        </w:tc>
+        <w:tc>
+          <w:tcPr>
+            <w:tcW w:w="1466" w:type="dxa"/>
+            <w:tcBorders>
+              <w:left w:val="single" w:sz="4" w:space="0" w:color="000000"/>
+              <w:bottom w:val="single" w:sz="4" w:space="0" w:color="000000"/>
+              <w:right w:val="single" w:sz="4" w:space="0" w:color="000000"/>
+            </w:tcBorders>
+            <w:vAlign w:val="center"/>
+          </w:tcPr>
+          <w:p>
+            <w:pPr>
+              <w:pStyle w:val="Style16"/>
+              <w:spacing w:lineRule="auto" w:line="240"/>
+              <w:ind w:hanging="0" w:left="0" w:right="0"/>
+              <w:rPr>
+                <w:sz w:val="24"/>
+                <w:szCs w:val="24"/>
+              </w:rPr>
+            </w:pPr>
+            <w:r>
+              <w:rPr>
+                <w:sz w:val="24"/>
+                <w:szCs w:val="24"/>
+              </w:rPr>
+              <w:t>0.96</w:t>
+            </w:r>
+          </w:p>
+        </w:tc>
+      </w:tr>
+      <w:tr>
+        <w:trPr/>
+        <w:tc>
+          <w:tcPr>
+            <w:tcW w:w="372" w:type="dxa"/>
+            <w:tcBorders>
+              <w:left w:val="single" w:sz="4" w:space="0" w:color="000000"/>
+              <w:bottom w:val="single" w:sz="4" w:space="0" w:color="000000"/>
+            </w:tcBorders>
+            <w:vAlign w:val="center"/>
+          </w:tcPr>
+          <w:p>
+            <w:pPr>
+              <w:pStyle w:val="Style16"/>
+              <w:spacing w:lineRule="auto" w:line="240"/>
+              <w:ind w:hanging="0" w:left="0" w:right="0"/>
+              <w:rPr>
+                <w:sz w:val="24"/>
+                <w:szCs w:val="24"/>
+              </w:rPr>
+            </w:pPr>
+            <w:r>
+              <w:rPr>
+                <w:sz w:val="24"/>
+                <w:szCs w:val="24"/>
+              </w:rPr>
+              <w:t>6</w:t>
+            </w:r>
+          </w:p>
+        </w:tc>
+        <w:tc>
+          <w:tcPr>
+            <w:tcW w:w="7188" w:type="dxa"/>
+            <w:tcBorders>
+              <w:left w:val="single" w:sz="4" w:space="0" w:color="000000"/>
+              <w:bottom w:val="single" w:sz="4" w:space="0" w:color="000000"/>
+            </w:tcBorders>
+            <w:vAlign w:val="center"/>
+          </w:tcPr>
+          <w:p>
+            <w:pPr>
+              <w:pStyle w:val="Style16"/>
+              <w:spacing w:lineRule="auto" w:line="240"/>
+              <w:ind w:hanging="0" w:left="0" w:right="0"/>
+              <w:rPr>
+                <w:sz w:val="24"/>
+                <w:szCs w:val="24"/>
+              </w:rPr>
+            </w:pPr>
+            <w:r>
+              <w:rPr>
+                <w:sz w:val="24"/>
+                <w:szCs w:val="24"/>
+              </w:rPr>
+              <w:t>[physician-fee-freeze=y, Class=republican]: 163 ==&gt; [el-salvador-aid=y]:</w:t>
+            </w:r>
+          </w:p>
+        </w:tc>
+        <w:tc>
+          <w:tcPr>
+            <w:tcW w:w="1466" w:type="dxa"/>
+            <w:tcBorders>
+              <w:left w:val="single" w:sz="4" w:space="0" w:color="000000"/>
+              <w:bottom w:val="single" w:sz="4" w:space="0" w:color="000000"/>
+              <w:right w:val="single" w:sz="4" w:space="0" w:color="000000"/>
+            </w:tcBorders>
+            <w:vAlign w:val="center"/>
+          </w:tcPr>
+          <w:p>
+            <w:pPr>
+              <w:pStyle w:val="Style16"/>
+              <w:spacing w:lineRule="auto" w:line="240"/>
+              <w:ind w:hanging="0" w:left="0" w:right="0"/>
+              <w:rPr>
+                <w:sz w:val="24"/>
+                <w:szCs w:val="24"/>
+              </w:rPr>
+            </w:pPr>
+            <w:r>
+              <w:rPr>
+                <w:sz w:val="24"/>
+                <w:szCs w:val="24"/>
+              </w:rPr>
+              <w:t>0.96</w:t>
+            </w:r>
+          </w:p>
+        </w:tc>
+      </w:tr>
+      <w:tr>
+        <w:trPr/>
+        <w:tc>
+          <w:tcPr>
+            <w:tcW w:w="372" w:type="dxa"/>
+            <w:tcBorders>
+              <w:left w:val="single" w:sz="4" w:space="0" w:color="000000"/>
+              <w:bottom w:val="single" w:sz="4" w:space="0" w:color="000000"/>
+            </w:tcBorders>
+            <w:vAlign w:val="center"/>
+          </w:tcPr>
+          <w:p>
+            <w:pPr>
+              <w:pStyle w:val="Style16"/>
+              <w:spacing w:lineRule="auto" w:line="240"/>
+              <w:ind w:hanging="0" w:left="0" w:right="0"/>
+              <w:rPr>
+                <w:sz w:val="24"/>
+                <w:szCs w:val="24"/>
+              </w:rPr>
+            </w:pPr>
+            <w:r>
+              <w:rPr>
+                <w:sz w:val="24"/>
+                <w:szCs w:val="24"/>
+              </w:rPr>
+              <w:t>7</w:t>
+            </w:r>
+          </w:p>
+        </w:tc>
+        <w:tc>
+          <w:tcPr>
+            <w:tcW w:w="7188" w:type="dxa"/>
+            <w:tcBorders>
+              <w:left w:val="single" w:sz="4" w:space="0" w:color="000000"/>
+              <w:bottom w:val="single" w:sz="4" w:space="0" w:color="000000"/>
+            </w:tcBorders>
+            <w:vAlign w:val="center"/>
+          </w:tcPr>
+          <w:p>
+            <w:pPr>
+              <w:pStyle w:val="Style16"/>
+              <w:spacing w:lineRule="auto" w:line="240"/>
+              <w:ind w:hanging="0" w:left="0" w:right="0"/>
+              <w:rPr>
+                <w:sz w:val="24"/>
+                <w:szCs w:val="24"/>
+              </w:rPr>
+            </w:pPr>
+            <w:r>
+              <w:rPr>
+                <w:sz w:val="24"/>
+                <w:szCs w:val="24"/>
+              </w:rPr>
+              <w:t>[religious-groups-in-schools=y, el-salvador-aid=y, superfund-right-to-sue=y]: 160 ==&gt; [crime=y]:</w:t>
+            </w:r>
+          </w:p>
+        </w:tc>
+        <w:tc>
+          <w:tcPr>
+            <w:tcW w:w="1466" w:type="dxa"/>
+            <w:tcBorders>
+              <w:left w:val="single" w:sz="4" w:space="0" w:color="000000"/>
+              <w:bottom w:val="single" w:sz="4" w:space="0" w:color="000000"/>
+              <w:right w:val="single" w:sz="4" w:space="0" w:color="000000"/>
+            </w:tcBorders>
+            <w:vAlign w:val="center"/>
+          </w:tcPr>
+          <w:p>
+            <w:pPr>
+              <w:pStyle w:val="Style16"/>
+              <w:spacing w:lineRule="auto" w:line="240"/>
+              <w:ind w:hanging="0" w:left="0" w:right="0"/>
+              <w:rPr>
+                <w:sz w:val="24"/>
+                <w:szCs w:val="24"/>
+              </w:rPr>
+            </w:pPr>
+            <w:r>
+              <w:rPr>
+                <w:sz w:val="24"/>
+                <w:szCs w:val="24"/>
+              </w:rPr>
+              <w:t>0.96</w:t>
+            </w:r>
+          </w:p>
+        </w:tc>
+      </w:tr>
+      <w:tr>
+        <w:trPr/>
+        <w:tc>
+          <w:tcPr>
+            <w:tcW w:w="372" w:type="dxa"/>
+            <w:tcBorders>
+              <w:left w:val="single" w:sz="4" w:space="0" w:color="000000"/>
+              <w:bottom w:val="single" w:sz="4" w:space="0" w:color="000000"/>
+            </w:tcBorders>
+            <w:vAlign w:val="center"/>
+          </w:tcPr>
+          <w:p>
+            <w:pPr>
+              <w:pStyle w:val="Style16"/>
+              <w:spacing w:lineRule="auto" w:line="240"/>
+              <w:ind w:hanging="0" w:left="0" w:right="0"/>
+              <w:rPr>
+                <w:sz w:val="24"/>
+                <w:szCs w:val="24"/>
+              </w:rPr>
+            </w:pPr>
+            <w:r>
+              <w:rPr>
+                <w:sz w:val="24"/>
+                <w:szCs w:val="24"/>
+              </w:rPr>
+              <w:t>8</w:t>
+            </w:r>
+          </w:p>
+        </w:tc>
+        <w:tc>
+          <w:tcPr>
+            <w:tcW w:w="7188" w:type="dxa"/>
+            <w:tcBorders>
+              <w:left w:val="single" w:sz="4" w:space="0" w:color="000000"/>
+              <w:bottom w:val="single" w:sz="4" w:space="0" w:color="000000"/>
+            </w:tcBorders>
+            <w:vAlign w:val="center"/>
+          </w:tcPr>
+          <w:p>
+            <w:pPr>
+              <w:pStyle w:val="Style16"/>
+              <w:spacing w:lineRule="auto" w:line="240"/>
+              <w:ind w:hanging="0" w:left="0" w:right="0"/>
+              <w:rPr>
+                <w:sz w:val="24"/>
+                <w:szCs w:val="24"/>
+              </w:rPr>
+            </w:pPr>
+            <w:r>
+              <w:rPr>
+                <w:sz w:val="24"/>
+                <w:szCs w:val="24"/>
+              </w:rPr>
+              <w:t>[el-salvador-aid=y, superfund-right-to-sue=y]: 170 ==&gt; [crime=y]:</w:t>
+            </w:r>
+          </w:p>
+        </w:tc>
+        <w:tc>
+          <w:tcPr>
+            <w:tcW w:w="1466" w:type="dxa"/>
+            <w:tcBorders>
+              <w:left w:val="single" w:sz="4" w:space="0" w:color="000000"/>
+              <w:bottom w:val="single" w:sz="4" w:space="0" w:color="000000"/>
+              <w:right w:val="single" w:sz="4" w:space="0" w:color="000000"/>
+            </w:tcBorders>
+            <w:vAlign w:val="center"/>
+          </w:tcPr>
+          <w:p>
+            <w:pPr>
+              <w:pStyle w:val="Style16"/>
+              <w:spacing w:lineRule="auto" w:line="240"/>
+              <w:ind w:hanging="0" w:left="0" w:right="0"/>
+              <w:rPr>
+                <w:sz w:val="24"/>
+                <w:szCs w:val="24"/>
+              </w:rPr>
+            </w:pPr>
+            <w:r>
+              <w:rPr>
+                <w:sz w:val="24"/>
+                <w:szCs w:val="24"/>
+              </w:rPr>
+              <w:t>0.95</w:t>
+            </w:r>
+          </w:p>
+        </w:tc>
+      </w:tr>
+      <w:tr>
+        <w:trPr/>
+        <w:tc>
+          <w:tcPr>
+            <w:tcW w:w="372" w:type="dxa"/>
+            <w:tcBorders>
+              <w:left w:val="single" w:sz="4" w:space="0" w:color="000000"/>
+              <w:bottom w:val="single" w:sz="4" w:space="0" w:color="000000"/>
+            </w:tcBorders>
+            <w:vAlign w:val="center"/>
+          </w:tcPr>
+          <w:p>
+            <w:pPr>
+              <w:pStyle w:val="Style16"/>
+              <w:spacing w:lineRule="auto" w:line="240"/>
+              <w:ind w:hanging="0" w:left="0" w:right="0"/>
+              <w:rPr>
+                <w:sz w:val="24"/>
+                <w:szCs w:val="24"/>
+              </w:rPr>
+            </w:pPr>
+            <w:r>
+              <w:rPr>
+                <w:sz w:val="24"/>
+                <w:szCs w:val="24"/>
+              </w:rPr>
+              <w:t>9</w:t>
+            </w:r>
+          </w:p>
+        </w:tc>
+        <w:tc>
+          <w:tcPr>
+            <w:tcW w:w="7188" w:type="dxa"/>
+            <w:tcBorders>
+              <w:left w:val="single" w:sz="4" w:space="0" w:color="000000"/>
+              <w:bottom w:val="single" w:sz="4" w:space="0" w:color="000000"/>
+            </w:tcBorders>
+            <w:vAlign w:val="center"/>
+          </w:tcPr>
+          <w:p>
+            <w:pPr>
+              <w:pStyle w:val="Style16"/>
+              <w:spacing w:lineRule="auto" w:line="240"/>
+              <w:ind w:hanging="0" w:left="0" w:right="0"/>
+              <w:rPr>
+                <w:sz w:val="24"/>
+                <w:szCs w:val="24"/>
+              </w:rPr>
+            </w:pPr>
+            <w:r>
+              <w:rPr>
+                <w:sz w:val="24"/>
+                <w:szCs w:val="24"/>
+              </w:rPr>
+              <w:t>[crime=y, physician-fee-freeze=y]: 168 ==&gt; [el-salvador-aid=y]:</w:t>
+            </w:r>
+          </w:p>
+        </w:tc>
+        <w:tc>
+          <w:tcPr>
+            <w:tcW w:w="1466" w:type="dxa"/>
+            <w:tcBorders>
+              <w:left w:val="single" w:sz="4" w:space="0" w:color="000000"/>
+              <w:bottom w:val="single" w:sz="4" w:space="0" w:color="000000"/>
+              <w:right w:val="single" w:sz="4" w:space="0" w:color="000000"/>
+            </w:tcBorders>
+            <w:vAlign w:val="center"/>
+          </w:tcPr>
+          <w:p>
+            <w:pPr>
+              <w:pStyle w:val="Style16"/>
+              <w:spacing w:lineRule="auto" w:line="240"/>
+              <w:ind w:hanging="0" w:left="0" w:right="0"/>
+              <w:rPr>
+                <w:sz w:val="24"/>
+                <w:szCs w:val="24"/>
+              </w:rPr>
+            </w:pPr>
+            <w:r>
+              <w:rPr>
+                <w:sz w:val="24"/>
+                <w:szCs w:val="24"/>
+              </w:rPr>
+              <w:t>0.95</w:t>
+            </w:r>
+          </w:p>
+        </w:tc>
+      </w:tr>
+      <w:tr>
+        <w:trPr/>
+        <w:tc>
+          <w:tcPr>
+            <w:tcW w:w="372" w:type="dxa"/>
+            <w:tcBorders>
+              <w:left w:val="single" w:sz="4" w:space="0" w:color="000000"/>
+              <w:bottom w:val="single" w:sz="4" w:space="0" w:color="000000"/>
+            </w:tcBorders>
+            <w:vAlign w:val="center"/>
+          </w:tcPr>
+          <w:p>
+            <w:pPr>
+              <w:pStyle w:val="Style16"/>
+              <w:spacing w:lineRule="auto" w:line="240"/>
+              <w:ind w:hanging="0" w:left="0" w:right="0"/>
+              <w:rPr>
+                <w:sz w:val="24"/>
+                <w:szCs w:val="24"/>
+              </w:rPr>
+            </w:pPr>
+            <w:r>
+              <w:rPr>
+                <w:sz w:val="24"/>
+                <w:szCs w:val="24"/>
+              </w:rPr>
+              <w:t>10</w:t>
+            </w:r>
+          </w:p>
+        </w:tc>
+        <w:tc>
+          <w:tcPr>
+            <w:tcW w:w="7188" w:type="dxa"/>
+            <w:tcBorders>
+              <w:left w:val="single" w:sz="4" w:space="0" w:color="000000"/>
+              <w:bottom w:val="single" w:sz="4" w:space="0" w:color="000000"/>
+            </w:tcBorders>
+            <w:vAlign w:val="center"/>
+          </w:tcPr>
+          <w:p>
+            <w:pPr>
+              <w:pStyle w:val="Style16"/>
+              <w:spacing w:lineRule="auto" w:line="240"/>
+              <w:ind w:hanging="0" w:left="0" w:right="0"/>
+              <w:rPr>
+                <w:sz w:val="24"/>
+                <w:szCs w:val="24"/>
+              </w:rPr>
+            </w:pPr>
+            <w:r>
+              <w:rPr>
+                <w:sz w:val="24"/>
+                <w:szCs w:val="24"/>
+              </w:rPr>
+              <w:t>[el-salvador-aid=y, physician-fee-freeze=y]: 168 ==&gt; [crime=y]:</w:t>
+            </w:r>
+          </w:p>
+        </w:tc>
+        <w:tc>
+          <w:tcPr>
+            <w:tcW w:w="1466" w:type="dxa"/>
+            <w:tcBorders>
+              <w:left w:val="single" w:sz="4" w:space="0" w:color="000000"/>
+              <w:bottom w:val="single" w:sz="4" w:space="0" w:color="000000"/>
+              <w:right w:val="single" w:sz="4" w:space="0" w:color="000000"/>
+            </w:tcBorders>
+            <w:vAlign w:val="center"/>
+          </w:tcPr>
+          <w:p>
+            <w:pPr>
+              <w:pStyle w:val="Style16"/>
+              <w:spacing w:lineRule="auto" w:line="240"/>
+              <w:ind w:hanging="0" w:left="0"/>
+              <w:rPr>
+                <w:sz w:val="24"/>
+                <w:szCs w:val="24"/>
+              </w:rPr>
+            </w:pPr>
+            <w:r>
+              <w:rPr>
+                <w:sz w:val="24"/>
+                <w:szCs w:val="24"/>
+              </w:rPr>
+              <w:t>0.95</w:t>
+            </w:r>
+          </w:p>
+        </w:tc>
+      </w:tr>
+    </w:tbl>
+    <w:p>
+      <w:pPr>
+        <w:pStyle w:val="p11"/>
+        <w:ind w:hanging="0" w:left="0"/>
+        <w:rPr>
+          <w:lang w:val="uk-UA"/>
+        </w:rPr>
+      </w:pPr>
+      <w:r>
+        <w:rPr>
+          <w:lang w:val="uk-UA"/>
+        </w:rPr>
+        <w:tab/>
+      </w:r>
+    </w:p>
+    <w:p>
+      <w:pPr>
+        <w:pStyle w:val="H2"/>
+        <w:rPr/>
+      </w:pPr>
+      <w:r>
+        <w:rPr/>
+        <w:t xml:space="preserve">7 </w:t>
+      </w:r>
+      <w:r>
+        <w:rPr/>
+        <w:t>А</w:t>
+      </w:r>
+      <w:r>
+        <w:rPr/>
+        <w:t xml:space="preserve">лгоритм Apriori </w:t>
+      </w:r>
+      <w:r>
+        <w:rPr/>
+        <w:t xml:space="preserve">зі </w:t>
+      </w:r>
+      <w:r>
+        <w:rPr/>
+        <w:t>значення</w:t>
+      </w:r>
+      <w:r>
+        <w:rPr/>
+        <w:t>м</w:t>
+      </w:r>
+      <w:r>
+        <w:rPr/>
+        <w:t xml:space="preserve"> car</w:t>
+      </w:r>
+    </w:p>
+    <w:p>
+      <w:pPr>
+        <w:pStyle w:val="p11"/>
+        <w:rPr>
+          <w:lang w:val="uk-UA"/>
+        </w:rPr>
+      </w:pPr>
+      <w:r>
+        <w:rPr>
+          <w:lang w:val="uk-UA"/>
+        </w:rPr>
+      </w:r>
+    </w:p>
+    <w:p>
+      <w:pPr>
+        <w:pStyle w:val="p11"/>
+        <w:rPr>
+          <w:lang w:val="uk-UA"/>
+        </w:rPr>
+      </w:pPr>
+      <w:r>
+        <w:rPr>
+          <w:lang w:val="uk-UA"/>
+        </w:rPr>
+        <w:t>Результати схожі на першу спробу алгоритму. По правій стороні знаходяться значення впевненості алгоритму.</w:t>
+      </w:r>
+    </w:p>
+    <w:p>
+      <w:pPr>
+        <w:pStyle w:val="p11"/>
+        <w:rPr>
+          <w:lang w:val="uk-UA"/>
+        </w:rPr>
+      </w:pPr>
+      <w:r>
+        <w:rPr>
+          <w:lang w:val="uk-UA"/>
+        </w:rPr>
+        <w:t>Отримані результати описані на рисунку нижче:</w:t>
+      </w:r>
+    </w:p>
+    <w:p>
+      <w:pPr>
+        <w:pStyle w:val="IMG1"/>
+        <w:rPr/>
+      </w:pPr>
+      <w:r>
+        <w:rPr/>
+      </w:r>
+    </w:p>
+    <w:p>
+      <w:pPr>
+        <w:pStyle w:val="IMG1"/>
+        <w:rPr/>
+      </w:pPr>
+      <w:r>
+        <w:rPr/>
+        <w:drawing>
+          <wp:inline distT="0" distB="0" distL="0" distR="0">
+            <wp:extent cx="5731510" cy="6268720"/>
+            <wp:effectExtent l="0" t="0" r="0" b="0"/>
+            <wp:docPr id="4" name="Зображення4"/>
+            <wp:cNvGraphicFramePr>
+              <a:graphicFrameLocks xmlns:a="http://schemas.openxmlformats.org/drawingml/2006/main" noChangeAspect="1"/>
+            </wp:cNvGraphicFramePr>
+            <a:graphic xmlns:a="http://schemas.openxmlformats.org/drawingml/2006/main">
+              <a:graphicData uri="http://schemas.openxmlformats.org/drawingml/2006/picture">
+                <pic:pic xmlns:pic="http://schemas.openxmlformats.org/drawingml/2006/picture">
+                  <pic:nvPicPr>
+                    <pic:cNvPr id="4" name="Зображення4"/>
+                    <pic:cNvPicPr>
+                      <a:picLocks noChangeAspect="1" noChangeArrowheads="1"/>
+                    </pic:cNvPicPr>
+                  </pic:nvPicPr>
+                  <pic:blipFill>
+                    <a:blip r:embed="rId5"/>
+                    <a:stretch>
+                      <a:fillRect/>
+                    </a:stretch>
+                  </pic:blipFill>
+                  <pic:spPr bwMode="auto">
+                    <a:xfrm>
+                      <a:off x="0" y="0"/>
+                      <a:ext cx="5731510" cy="6268720"/>
+                    </a:xfrm>
+                    <a:prstGeom prst="rect">
+                      <a:avLst/>
+                    </a:prstGeom>
+                    <a:noFill/>
+                  </pic:spPr>
+                </pic:pic>
+              </a:graphicData>
+            </a:graphic>
+          </wp:inline>
+        </w:drawing>
+      </w:r>
+    </w:p>
+    <w:p>
+      <w:pPr>
+        <w:pStyle w:val="IMG1"/>
+        <w:rPr/>
+      </w:pPr>
+      <w:r>
+        <w:rPr/>
+        <w:t xml:space="preserve">Рисунок 7.1 — Вигляд результатів алгоритму з </w:t>
+      </w:r>
+      <w:r>
+        <w:rPr>
+          <w:lang w:val="en-US"/>
+        </w:rPr>
+        <w:t xml:space="preserve">car </w:t>
+      </w:r>
+      <w:r>
+        <w:rPr/>
+        <w:t xml:space="preserve">в значенні </w:t>
+      </w:r>
+      <w:r>
+        <w:rPr>
+          <w:lang w:val="en-US"/>
+        </w:rPr>
+        <w:t>True</w:t>
+      </w:r>
+    </w:p>
+    <w:p>
+      <w:pPr>
+        <w:pStyle w:val="p11"/>
+        <w:rPr>
+          <w:lang w:val="uk-UA"/>
+        </w:rPr>
+      </w:pPr>
+      <w:r>
+        <w:rPr>
+          <w:lang w:val="uk-UA"/>
+        </w:rPr>
+      </w:r>
+    </w:p>
+    <w:p>
+      <w:pPr>
+        <w:pStyle w:val="H2"/>
+        <w:rPr/>
+      </w:pPr>
+      <w:r>
+        <w:rPr/>
+        <w:t xml:space="preserve">8 </w:t>
+      </w:r>
+      <w:r>
+        <w:rPr/>
+        <w:t xml:space="preserve">Задача </w:t>
+      </w:r>
+      <w:r>
+        <w:rPr/>
+        <w:t xml:space="preserve">пошуку асоціативних правил для </w:t>
+      </w:r>
+      <w:r>
+        <w:rPr>
+          <w:i w:val="false"/>
+          <w:caps w:val="false"/>
+          <w:smallCaps w:val="false"/>
+          <w:spacing w:val="0"/>
+        </w:rPr>
+        <w:t>marketbasket.arff</w:t>
+      </w:r>
+    </w:p>
+    <w:p>
+      <w:pPr>
+        <w:pStyle w:val="P1"/>
+        <w:rPr/>
+      </w:pPr>
+      <w:r>
+        <w:rPr/>
+      </w:r>
+    </w:p>
+    <w:p>
+      <w:pPr>
+        <w:pStyle w:val="P1"/>
+        <w:rPr/>
+      </w:pPr>
+      <w:r>
+        <w:rPr/>
+        <w:t>Отримані результати наведено на рисунку нижче:</w:t>
+      </w:r>
+    </w:p>
+    <w:p>
+      <w:pPr>
+        <w:pStyle w:val="IMG1"/>
+        <w:rPr/>
+      </w:pPr>
+      <w:r>
+        <w:rPr/>
+      </w:r>
+    </w:p>
+    <w:p>
+      <w:pPr>
+        <w:pStyle w:val="IMG1"/>
+        <w:rPr/>
+      </w:pPr>
+      <w:r>
+        <w:rPr/>
+        <w:drawing>
+          <wp:inline distT="0" distB="0" distL="0" distR="0">
+            <wp:extent cx="5731510" cy="6268720"/>
+            <wp:effectExtent l="0" t="0" r="0" b="0"/>
+            <wp:docPr id="5" name="Зображення5"/>
+            <wp:cNvGraphicFramePr>
+              <a:graphicFrameLocks xmlns:a="http://schemas.openxmlformats.org/drawingml/2006/main" noChangeAspect="1"/>
+            </wp:cNvGraphicFramePr>
+            <a:graphic xmlns:a="http://schemas.openxmlformats.org/drawingml/2006/main">
+              <a:graphicData uri="http://schemas.openxmlformats.org/drawingml/2006/picture">
+                <pic:pic xmlns:pic="http://schemas.openxmlformats.org/drawingml/2006/picture">
+                  <pic:nvPicPr>
+                    <pic:cNvPr id="5" name="Зображення5"/>
+                    <pic:cNvPicPr>
+                      <a:picLocks noChangeAspect="1" noChangeArrowheads="1"/>
+                    </pic:cNvPicPr>
+                  </pic:nvPicPr>
+                  <pic:blipFill>
+                    <a:blip r:embed="rId6"/>
+                    <a:stretch>
+                      <a:fillRect/>
+                    </a:stretch>
+                  </pic:blipFill>
+                  <pic:spPr bwMode="auto">
+                    <a:xfrm>
+                      <a:off x="0" y="0"/>
+                      <a:ext cx="5731510" cy="6268720"/>
+                    </a:xfrm>
+                    <a:prstGeom prst="rect">
+                      <a:avLst/>
+                    </a:prstGeom>
+                    <a:noFill/>
+                  </pic:spPr>
+                </pic:pic>
+              </a:graphicData>
+            </a:graphic>
+          </wp:inline>
+        </w:drawing>
+      </w:r>
+    </w:p>
+    <w:p>
+      <w:pPr>
+        <w:pStyle w:val="IMG1"/>
+        <w:rPr/>
+      </w:pPr>
+      <w:r>
+        <w:rPr/>
+        <w:t>Рисунок 8.1 — Отримані результати для нової вибірки</w:t>
+      </w:r>
+    </w:p>
+    <w:p>
+      <w:pPr>
+        <w:pStyle w:val="P1"/>
+        <w:rPr/>
+      </w:pPr>
+      <w:r>
+        <w:rPr/>
+      </w:r>
+    </w:p>
+    <w:p>
+      <w:pPr>
+        <w:pStyle w:val="h11"/>
+        <w:rPr/>
+      </w:pPr>
+      <w:r>
+        <w:rPr/>
+        <w:t>Висновки</w:t>
+      </w:r>
+    </w:p>
+    <w:p>
+      <w:pPr>
+        <w:pStyle w:val="p11"/>
+        <w:rPr/>
+      </w:pPr>
+      <w:r>
+        <w:rPr/>
+      </w:r>
+    </w:p>
+    <w:p>
+      <w:pPr>
+        <w:pStyle w:val="p11"/>
+        <w:rPr/>
+      </w:pPr>
+      <w:r>
+        <w:rPr/>
+        <w:t xml:space="preserve">Благодаттю Господа нашого Ісуса Христа зроблено роботу. Було розглянуто два алгоритми пошуку асоціативних правил — </w:t>
+      </w:r>
+      <w:r>
+        <w:rPr>
+          <w:lang w:val="en-US"/>
+        </w:rPr>
+        <w:t xml:space="preserve">Apriori </w:t>
+      </w:r>
+      <w:r>
+        <w:rPr>
+          <w:lang w:val="uk-UA"/>
+        </w:rPr>
+        <w:t xml:space="preserve">та </w:t>
+      </w:r>
+      <w:r>
+        <w:rPr>
+          <w:lang w:val="en-US"/>
+        </w:rPr>
+        <w:t>FPGrowth.</w:t>
       </w:r>
     </w:p>
     <w:p>
@@ -1282,255 +4197,6 @@
     </w:sectPr>
   </w:body>
 </w:document>
-</file>
-
-<file path=word/numbering.xml><?xml version="1.0" encoding="utf-8"?>
-<w:numbering xmlns:w="http://schemas.openxmlformats.org/wordprocessingml/2006/main" xmlns:o="urn:schemas-microsoft-com:office:office" xmlns:r="http://schemas.openxmlformats.org/officeDocument/2006/relationships" xmlns:v="urn:schemas-microsoft-com:vml" xmlns:mc="http://schemas.openxmlformats.org/markup-compatibility/2006" xmlns:w14="http://schemas.microsoft.com/office/word/2010/wordml" mc:Ignorable="w14">
-  <w:abstractNum w:abstractNumId="1">
-    <w:lvl w:ilvl="0">
-      <w:start w:val="1"/>
-      <w:numFmt w:val="decimal"/>
-      <w:lvlText w:val="%1."/>
-      <w:lvlJc w:val="left"/>
-      <w:pPr>
-        <w:tabs>
-          <w:tab w:val="num" w:pos="720"/>
-        </w:tabs>
-        <w:ind w:left="720" w:hanging="360"/>
-      </w:pPr>
-      <w:rPr/>
-    </w:lvl>
-    <w:lvl w:ilvl="1">
-      <w:start w:val="1"/>
-      <w:numFmt w:val="decimal"/>
-      <w:lvlText w:val="%2."/>
-      <w:lvlJc w:val="left"/>
-      <w:pPr>
-        <w:tabs>
-          <w:tab w:val="num" w:pos="1080"/>
-        </w:tabs>
-        <w:ind w:left="1080" w:hanging="360"/>
-      </w:pPr>
-      <w:rPr/>
-    </w:lvl>
-    <w:lvl w:ilvl="2">
-      <w:start w:val="1"/>
-      <w:numFmt w:val="decimal"/>
-      <w:lvlText w:val="%3."/>
-      <w:lvlJc w:val="left"/>
-      <w:pPr>
-        <w:tabs>
-          <w:tab w:val="num" w:pos="1440"/>
-        </w:tabs>
-        <w:ind w:left="1440" w:hanging="360"/>
-      </w:pPr>
-      <w:rPr/>
-    </w:lvl>
-    <w:lvl w:ilvl="3">
-      <w:start w:val="1"/>
-      <w:numFmt w:val="decimal"/>
-      <w:lvlText w:val="%4."/>
-      <w:lvlJc w:val="left"/>
-      <w:pPr>
-        <w:tabs>
-          <w:tab w:val="num" w:pos="1800"/>
-        </w:tabs>
-        <w:ind w:left="1800" w:hanging="360"/>
-      </w:pPr>
-      <w:rPr/>
-    </w:lvl>
-    <w:lvl w:ilvl="4">
-      <w:start w:val="1"/>
-      <w:numFmt w:val="decimal"/>
-      <w:lvlText w:val="%5."/>
-      <w:lvlJc w:val="left"/>
-      <w:pPr>
-        <w:tabs>
-          <w:tab w:val="num" w:pos="2160"/>
-        </w:tabs>
-        <w:ind w:left="2160" w:hanging="360"/>
-      </w:pPr>
-      <w:rPr/>
-    </w:lvl>
-    <w:lvl w:ilvl="5">
-      <w:start w:val="1"/>
-      <w:numFmt w:val="decimal"/>
-      <w:lvlText w:val="%6."/>
-      <w:lvlJc w:val="left"/>
-      <w:pPr>
-        <w:tabs>
-          <w:tab w:val="num" w:pos="2520"/>
-        </w:tabs>
-        <w:ind w:left="2520" w:hanging="360"/>
-      </w:pPr>
-      <w:rPr/>
-    </w:lvl>
-    <w:lvl w:ilvl="6">
-      <w:start w:val="1"/>
-      <w:numFmt w:val="decimal"/>
-      <w:lvlText w:val="%7."/>
-      <w:lvlJc w:val="left"/>
-      <w:pPr>
-        <w:tabs>
-          <w:tab w:val="num" w:pos="2880"/>
-        </w:tabs>
-        <w:ind w:left="2880" w:hanging="360"/>
-      </w:pPr>
-      <w:rPr/>
-    </w:lvl>
-    <w:lvl w:ilvl="7">
-      <w:start w:val="1"/>
-      <w:numFmt w:val="decimal"/>
-      <w:lvlText w:val="%8."/>
-      <w:lvlJc w:val="left"/>
-      <w:pPr>
-        <w:tabs>
-          <w:tab w:val="num" w:pos="3240"/>
-        </w:tabs>
-        <w:ind w:left="3240" w:hanging="360"/>
-      </w:pPr>
-      <w:rPr/>
-    </w:lvl>
-    <w:lvl w:ilvl="8">
-      <w:start w:val="1"/>
-      <w:numFmt w:val="decimal"/>
-      <w:lvlText w:val="%9."/>
-      <w:lvlJc w:val="left"/>
-      <w:pPr>
-        <w:tabs>
-          <w:tab w:val="num" w:pos="3600"/>
-        </w:tabs>
-        <w:ind w:left="3600" w:hanging="360"/>
-      </w:pPr>
-      <w:rPr/>
-    </w:lvl>
-  </w:abstractNum>
-  <w:abstractNum w:abstractNumId="2">
-    <w:lvl w:ilvl="0">
-      <w:start w:val="1"/>
-      <w:numFmt w:val="none"/>
-      <w:suff w:val="nothing"/>
-      <w:lvlText w:val=""/>
-      <w:lvlJc w:val="left"/>
-      <w:pPr>
-        <w:tabs>
-          <w:tab w:val="num" w:pos="0"/>
-        </w:tabs>
-        <w:ind w:left="0" w:hanging="0"/>
-      </w:pPr>
-    </w:lvl>
-    <w:lvl w:ilvl="1">
-      <w:start w:val="1"/>
-      <w:numFmt w:val="none"/>
-      <w:suff w:val="nothing"/>
-      <w:lvlText w:val=""/>
-      <w:lvlJc w:val="left"/>
-      <w:pPr>
-        <w:tabs>
-          <w:tab w:val="num" w:pos="0"/>
-        </w:tabs>
-        <w:ind w:left="0" w:hanging="0"/>
-      </w:pPr>
-    </w:lvl>
-    <w:lvl w:ilvl="2">
-      <w:start w:val="1"/>
-      <w:numFmt w:val="none"/>
-      <w:suff w:val="nothing"/>
-      <w:lvlText w:val=""/>
-      <w:lvlJc w:val="left"/>
-      <w:pPr>
-        <w:tabs>
-          <w:tab w:val="num" w:pos="0"/>
-        </w:tabs>
-        <w:ind w:left="0" w:hanging="0"/>
-      </w:pPr>
-    </w:lvl>
-    <w:lvl w:ilvl="3">
-      <w:start w:val="1"/>
-      <w:numFmt w:val="none"/>
-      <w:suff w:val="nothing"/>
-      <w:lvlText w:val=""/>
-      <w:lvlJc w:val="left"/>
-      <w:pPr>
-        <w:tabs>
-          <w:tab w:val="num" w:pos="0"/>
-        </w:tabs>
-        <w:ind w:left="0" w:hanging="0"/>
-      </w:pPr>
-    </w:lvl>
-    <w:lvl w:ilvl="4">
-      <w:start w:val="1"/>
-      <w:numFmt w:val="none"/>
-      <w:suff w:val="nothing"/>
-      <w:lvlText w:val=""/>
-      <w:lvlJc w:val="left"/>
-      <w:pPr>
-        <w:tabs>
-          <w:tab w:val="num" w:pos="0"/>
-        </w:tabs>
-        <w:ind w:left="0" w:hanging="0"/>
-      </w:pPr>
-    </w:lvl>
-    <w:lvl w:ilvl="5">
-      <w:start w:val="1"/>
-      <w:numFmt w:val="none"/>
-      <w:suff w:val="nothing"/>
-      <w:lvlText w:val=""/>
-      <w:lvlJc w:val="left"/>
-      <w:pPr>
-        <w:tabs>
-          <w:tab w:val="num" w:pos="0"/>
-        </w:tabs>
-        <w:ind w:left="0" w:hanging="0"/>
-      </w:pPr>
-    </w:lvl>
-    <w:lvl w:ilvl="6">
-      <w:start w:val="1"/>
-      <w:numFmt w:val="none"/>
-      <w:suff w:val="nothing"/>
-      <w:lvlText w:val=""/>
-      <w:lvlJc w:val="left"/>
-      <w:pPr>
-        <w:tabs>
-          <w:tab w:val="num" w:pos="0"/>
-        </w:tabs>
-        <w:ind w:left="0" w:hanging="0"/>
-      </w:pPr>
-    </w:lvl>
-    <w:lvl w:ilvl="7">
-      <w:start w:val="1"/>
-      <w:numFmt w:val="none"/>
-      <w:suff w:val="nothing"/>
-      <w:lvlText w:val=""/>
-      <w:lvlJc w:val="left"/>
-      <w:pPr>
-        <w:tabs>
-          <w:tab w:val="num" w:pos="0"/>
-        </w:tabs>
-        <w:ind w:left="0" w:hanging="0"/>
-      </w:pPr>
-    </w:lvl>
-    <w:lvl w:ilvl="8">
-      <w:start w:val="1"/>
-      <w:numFmt w:val="none"/>
-      <w:suff w:val="nothing"/>
-      <w:lvlText w:val=""/>
-      <w:lvlJc w:val="left"/>
-      <w:pPr>
-        <w:tabs>
-          <w:tab w:val="num" w:pos="0"/>
-        </w:tabs>
-        <w:ind w:left="0" w:hanging="0"/>
-      </w:pPr>
-    </w:lvl>
-  </w:abstractNum>
-  <w:num w:numId="1">
-    <w:abstractNumId w:val="1"/>
-  </w:num>
-  <w:num w:numId="2">
-    <w:abstractNumId w:val="2"/>
-  </w:num>
-</w:numbering>
 </file>
 
 <file path=word/styles.xml><?xml version="1.0" encoding="utf-8"?>
@@ -2320,13 +4986,13 @@
       <w:lang w:val="en-US" w:eastAsia="uk-UA"/>
     </w:rPr>
   </w:style>
-  <w:style w:type="character" w:styleId="user">
-    <w:name w:val="Символ нумерації (user)"/>
+  <w:style w:type="character" w:styleId="Style12">
+    <w:name w:val="Символ нумерації"/>
     <w:qFormat/>
     <w:rPr/>
   </w:style>
-  <w:style w:type="character" w:styleId="Style12">
-    <w:name w:val="Маркери"/>
+  <w:style w:type="character" w:styleId="user">
+    <w:name w:val="Маркери (user)"/>
     <w:qFormat/>
     <w:rPr>
       <w:rFonts w:ascii="OpenSymbol" w:hAnsi="OpenSymbol" w:eastAsia="OpenSymbol" w:cs="OpenSymbol"/>
@@ -2349,7 +5015,7 @@
       <w:spacing w:before="240" w:after="120"/>
     </w:pPr>
     <w:rPr>
-      <w:rFonts w:ascii="Liberation Sans" w:hAnsi="Liberation Sans" w:eastAsia="Microsoft YaHei" w:cs="Arial Unicode MS"/>
+      <w:rFonts w:ascii="Liberation Sans" w:hAnsi="Liberation Sans" w:eastAsia="Microsoft YaHei" w:cs="Lucida Sans"/>
       <w:sz w:val="28"/>
       <w:szCs w:val="28"/>
     </w:rPr>
@@ -2394,7 +5060,7 @@
       <w:suppressLineNumbers/>
     </w:pPr>
     <w:rPr>
-      <w:rFonts w:cs="Arial Unicode MS"/>
+      <w:rFonts w:cs="Lucida Sans"/>
     </w:rPr>
   </w:style>
   <w:style w:type="paragraph" w:styleId="user1">
@@ -2407,7 +5073,7 @@
       <w:spacing w:before="240" w:after="120"/>
     </w:pPr>
     <w:rPr>
-      <w:rFonts w:ascii="Liberation Sans" w:hAnsi="Liberation Sans" w:eastAsia="Microsoft YaHei" w:cs="Lucida Sans"/>
+      <w:rFonts w:ascii="Liberation Sans" w:hAnsi="Liberation Sans" w:eastAsia="Microsoft YaHei" w:cs="Arial Unicode MS"/>
       <w:sz w:val="28"/>
       <w:szCs w:val="28"/>
     </w:rPr>
@@ -2420,12 +5086,12 @@
       <w:suppressLineNumbers/>
     </w:pPr>
     <w:rPr>
-      <w:rFonts w:cs="Lucida Sans"/>
+      <w:rFonts w:cs="Arial Unicode MS"/>
     </w:rPr>
   </w:style>
   <w:style w:type="paragraph" w:styleId="IndexHeading">
     <w:name w:val="index heading"/>
-    <w:basedOn w:val="Style13"/>
+    <w:basedOn w:val="user1"/>
     <w:pPr/>
     <w:rPr/>
   </w:style>
@@ -2730,8 +5396,38 @@
     </w:pPr>
     <w:rPr/>
   </w:style>
-  <w:style w:type="numbering" w:styleId="Style15" w:default="1">
-    <w:name w:val="Без маркерів"/>
+  <w:style w:type="paragraph" w:styleId="Style15">
+    <w:name w:val="Вміст рамки"/>
+    <w:basedOn w:val="Normal"/>
+    <w:qFormat/>
+    <w:pPr/>
+    <w:rPr/>
+  </w:style>
+  <w:style w:type="paragraph" w:styleId="Style16">
+    <w:name w:val="Вміст таблиці"/>
+    <w:basedOn w:val="Normal"/>
+    <w:qFormat/>
+    <w:pPr>
+      <w:widowControl w:val="false"/>
+      <w:suppressLineNumbers/>
+    </w:pPr>
+    <w:rPr/>
+  </w:style>
+  <w:style w:type="paragraph" w:styleId="Style17">
+    <w:name w:val="Заголовок таблиці"/>
+    <w:basedOn w:val="Style16"/>
+    <w:qFormat/>
+    <w:pPr>
+      <w:suppressLineNumbers/>
+      <w:jc w:val="center"/>
+    </w:pPr>
+    <w:rPr>
+      <w:b/>
+      <w:bCs/>
+    </w:rPr>
+  </w:style>
+  <w:style w:type="numbering" w:styleId="user3" w:default="1">
+    <w:name w:val="Без маркерів (user)"/>
     <w:uiPriority w:val="99"/>
     <w:semiHidden/>
     <w:unhideWhenUsed/>

</xml_diff>